<commit_message>
Update Sprint 1 working document
Co-Authored-By: Claude Opus 5.5 <noreply@anthropic.com>
</commit_message>
<xml_diff>
--- a/docs/Sprint1_Working.docx
+++ b/docs/Sprint1_Working.docx
@@ -2473,6 +2473,8 @@
         <w:ind w:left="360"/>
         <w:rPr>
           <w:rFonts w:ascii="Segoe UI" w:hAnsi="Segoe UI" w:cs="Segoe UI"/>
+          <w:b/>
+          <w:bCs/>
           <w:color w:val="000000" w:themeColor="text1"/>
           <w:sz w:val="20"/>
           <w:szCs w:val="20"/>
@@ -2480,17 +2482,12 @@
       </w:pPr>
       <w:r>
         <w:rPr>
+          <w:b/>
+          <w:bCs/>
           <w:color w:val="000000" w:themeColor="text1"/>
           <w:lang w:val="en-US"/>
         </w:rPr>
         <w:t>Assumptions:</w:t>
-      </w:r>
-      <w:r>
-        <w:rPr>
-          <w:color w:val="000000" w:themeColor="text1"/>
-          <w:lang w:val="en-US"/>
-        </w:rPr>
-        <w:br/>
       </w:r>
     </w:p>
     <w:p>

</xml_diff>

<commit_message>
Add Sprint 1 deck, presentation script and updated architecture diagram
Numbered 10-step architecture diagram (8 tools grouped, allocator,
two evaluation tracks), Sprint 1 slide deck, presentation script
and updated working notes.

Co-Authored-By: Claude Sonnet 5.5 <noreply@anthropic.com>
</commit_message>
<xml_diff>
--- a/docs/Sprint1_Working.docx
+++ b/docs/Sprint1_Working.docx
@@ -93,15 +93,7 @@
           <w:color w:val="000000" w:themeColor="text1"/>
           <w:lang w:val="en-US"/>
         </w:rPr>
-        <w:t>In</w:t>
-      </w:r>
-      <w:r>
-        <w:rPr>
-          <w:rFonts w:asciiTheme="minorHAnsi" w:hAnsiTheme="minorHAnsi" w:cstheme="minorBidi"/>
-          <w:color w:val="000000" w:themeColor="text1"/>
-          <w:lang w:val="en-US"/>
-        </w:rPr>
-        <w:t xml:space="preserve"> a sample inbox of 30 requests, 7 are ambiguous or missing key details, and 4 ask for a workshop that isn't allowed to take the job.</w:t>
+        <w:t>In a sample inbox of 30 requests, 7 are ambiguous or missing key details, and 4 ask for a workshop that isn't allowed to take the job.</w:t>
       </w:r>
     </w:p>
     <w:p>
@@ -135,7 +127,6 @@
       <w:pPr>
         <w:shd w:val="clear" w:color="auto" w:fill="FFFFFF" w:themeFill="background1"/>
         <w:rPr>
-          <w:rFonts w:asciiTheme="minorHAnsi" w:hAnsiTheme="minorHAnsi" w:cstheme="minorBidi"/>
           <w:color w:val="000000" w:themeColor="text1"/>
           <w:lang w:val="en-US"/>
         </w:rPr>
@@ -147,19 +138,35 @@
         </w:rPr>
         <w:t xml:space="preserve">Primary objective: </w:t>
       </w:r>
+      <w:proofErr w:type="spellStart"/>
       <w:r>
         <w:rPr>
-          <w:rFonts w:asciiTheme="minorHAnsi" w:hAnsiTheme="minorHAnsi" w:cstheme="minorBidi"/>
           <w:color w:val="000000" w:themeColor="text1"/>
           <w:lang w:val="en-US"/>
         </w:rPr>
-        <w:t>minimise lateness</w:t>
+        <w:t>Minimise</w:t>
+      </w:r>
+      <w:proofErr w:type="spellEnd"/>
+      <w:r>
+        <w:rPr>
+          <w:color w:val="000000" w:themeColor="text1"/>
+          <w:lang w:val="en-US"/>
+        </w:rPr>
+        <w:t xml:space="preserve"> </w:t>
+      </w:r>
+      <w:r>
+        <w:rPr>
+          <w:color w:val="000000" w:themeColor="text1"/>
+          <w:lang w:val="en-US"/>
+        </w:rPr>
+        <w:t>lateness</w:t>
       </w:r>
     </w:p>
     <w:p>
       <w:pPr>
         <w:shd w:val="clear" w:color="auto" w:fill="FFFFFF" w:themeFill="background1"/>
         <w:rPr>
+          <w:rFonts w:asciiTheme="minorHAnsi" w:hAnsiTheme="minorHAnsi" w:cstheme="minorBidi"/>
           <w:color w:val="000000" w:themeColor="text1"/>
           <w:lang w:val="en-US"/>
         </w:rPr>
@@ -193,7 +200,7 @@
           <w:color w:val="000000" w:themeColor="text1"/>
           <w:lang w:val="en-US"/>
         </w:rPr>
-        <w:t>Fair</w:t>
+        <w:t>Robust to</w:t>
       </w:r>
       <w:r>
         <w:rPr>
@@ -209,7 +216,7 @@
           <w:color w:val="000000" w:themeColor="text1"/>
           <w:lang w:val="en-US"/>
         </w:rPr>
-        <w:t>allocation</w:t>
+        <w:t>failure</w:t>
       </w:r>
       <w:r>
         <w:rPr>
@@ -217,7 +224,7 @@
           <w:color w:val="000000" w:themeColor="text1"/>
           <w:lang w:val="en-US"/>
         </w:rPr>
-        <w:t xml:space="preserve"> &amp; hybrid (</w:t>
+        <w:t xml:space="preserve"> </w:t>
       </w:r>
       <w:r>
         <w:rPr>
@@ -225,15 +232,7 @@
           <w:color w:val="000000" w:themeColor="text1"/>
           <w:lang w:val="en-US"/>
         </w:rPr>
-        <w:t>0.7 lateness + 0.3 fairness</w:t>
-      </w:r>
-      <w:r>
-        <w:rPr>
-          <w:rFonts w:asciiTheme="minorHAnsi" w:hAnsiTheme="minorHAnsi" w:cstheme="minorBidi"/>
-          <w:color w:val="000000" w:themeColor="text1"/>
-          <w:lang w:val="en-US"/>
-        </w:rPr>
-        <w:t>)</w:t>
+        <w:t xml:space="preserve">&amp; hybrid </w:t>
       </w:r>
     </w:p>
     <w:p>
@@ -274,10 +273,10 @@
           <w:lang w:val="en-US"/>
         </w:rPr>
         <w:drawing>
-          <wp:inline distT="0" distB="0" distL="0" distR="0" wp14:anchorId="635CFFD5" wp14:editId="747A301D">
+          <wp:inline distT="0" distB="0" distL="0" distR="0" wp14:anchorId="51D76B0E" wp14:editId="6B265D72">
             <wp:extent cx="5731510" cy="3402965"/>
             <wp:effectExtent l="0" t="0" r="0" b="635"/>
-            <wp:docPr id="467645760" name="Picture 1"/>
+            <wp:docPr id="1010512771" name="Picture 1"/>
             <wp:cNvGraphicFramePr>
               <a:graphicFrameLocks xmlns:a="http://schemas.openxmlformats.org/drawingml/2006/main" noChangeAspect="1"/>
             </wp:cNvGraphicFramePr>
@@ -285,7 +284,7 @@
               <a:graphicData uri="http://schemas.openxmlformats.org/drawingml/2006/picture">
                 <pic:pic xmlns:pic="http://schemas.openxmlformats.org/drawingml/2006/picture">
                   <pic:nvPicPr>
-                    <pic:cNvPr id="467645760" name=""/>
+                    <pic:cNvPr id="1010512771" name=""/>
                     <pic:cNvPicPr/>
                   </pic:nvPicPr>
                   <pic:blipFill>
@@ -1779,10 +1778,12 @@
     </w:p>
     <w:p>
       <w:pPr>
-        <w:pStyle w:val="NormalWeb"/>
-        <w:spacing w:before="24" w:beforeAutospacing="0" w:after="48" w:afterAutospacing="0"/>
+        <w:shd w:val="clear" w:color="auto" w:fill="FFFFFF" w:themeFill="background1"/>
+        <w:ind w:left="360"/>
         <w:rPr>
           <w:rFonts w:ascii="Segoe UI" w:hAnsi="Segoe UI" w:cs="Segoe UI"/>
+          <w:b/>
+          <w:bCs/>
           <w:color w:val="000000" w:themeColor="text1"/>
           <w:sz w:val="20"/>
           <w:szCs w:val="20"/>
@@ -1790,22 +1791,1324 @@
       </w:pPr>
       <w:r>
         <w:rPr>
-          <w:rStyle w:val="Strong"/>
+          <w:b/>
+          <w:bCs/>
+          <w:color w:val="000000" w:themeColor="text1"/>
+          <w:lang w:val="en-US"/>
+        </w:rPr>
+        <w:t>Assumptions:</w:t>
+      </w:r>
+    </w:p>
+    <w:p>
+      <w:pPr>
+        <w:pStyle w:val="ListParagraph"/>
+        <w:numPr>
+          <w:ilvl w:val="0"/>
+          <w:numId w:val="10"/>
+        </w:numPr>
+        <w:shd w:val="clear" w:color="auto" w:fill="FFFFFF" w:themeFill="background1"/>
+        <w:rPr>
           <w:rFonts w:ascii="Segoe UI" w:hAnsi="Segoe UI" w:cs="Segoe UI"/>
           <w:color w:val="000000" w:themeColor="text1"/>
           <w:sz w:val="20"/>
           <w:szCs w:val="20"/>
         </w:rPr>
-        <w:t>First simulator results</w:t>
+      </w:pPr>
+      <w:r>
+        <w:rPr>
+          <w:rFonts w:ascii="Segoe UI" w:hAnsi="Segoe UI" w:cs="Segoe UI"/>
+          <w:color w:val="000000" w:themeColor="text1"/>
+          <w:sz w:val="20"/>
+          <w:szCs w:val="20"/>
+        </w:rPr>
+        <w:t>Workshop profile cards (capacity, queue, status, defect rate) are accurate on the day of the decision</w:t>
+      </w:r>
+    </w:p>
+    <w:p>
+      <w:pPr>
+        <w:pStyle w:val="ListParagraph"/>
+        <w:numPr>
+          <w:ilvl w:val="0"/>
+          <w:numId w:val="10"/>
+        </w:numPr>
+        <w:shd w:val="clear" w:color="auto" w:fill="FFFFFF" w:themeFill="background1"/>
+        <w:rPr>
+          <w:rFonts w:ascii="Segoe UI" w:hAnsi="Segoe UI" w:cs="Segoe UI"/>
+          <w:color w:val="000000" w:themeColor="text1"/>
+          <w:sz w:val="20"/>
+          <w:szCs w:val="20"/>
+        </w:rPr>
+      </w:pPr>
+      <w:r>
+        <w:rPr>
+          <w:rFonts w:ascii="Segoe UI" w:hAnsi="Segoe UI" w:cs="Segoe UI"/>
+          <w:color w:val="000000" w:themeColor="text1"/>
+          <w:sz w:val="20"/>
+          <w:szCs w:val="20"/>
+        </w:rPr>
+        <w:t>Delivery time = queue + making time + transport</w:t>
+      </w:r>
+    </w:p>
+    <w:p>
+      <w:pPr>
+        <w:pStyle w:val="ListParagraph"/>
+        <w:numPr>
+          <w:ilvl w:val="0"/>
+          <w:numId w:val="9"/>
+        </w:numPr>
+        <w:rPr>
+          <w:rFonts w:ascii="Segoe UI" w:hAnsi="Segoe UI" w:cs="Segoe UI"/>
+          <w:color w:val="000000" w:themeColor="text1"/>
+          <w:sz w:val="20"/>
+          <w:szCs w:val="20"/>
+        </w:rPr>
+      </w:pPr>
+      <w:r>
+        <w:rPr>
+          <w:rFonts w:ascii="Segoe UI" w:hAnsi="Segoe UI" w:cs="Segoe UI"/>
+          <w:color w:val="000000" w:themeColor="text1"/>
+          <w:sz w:val="20"/>
+          <w:szCs w:val="20"/>
+        </w:rPr>
+        <w:t>The AI can reliably pull the right details out of short, informal chat messages</w:t>
+      </w:r>
+    </w:p>
+    <w:p>
+      <w:pPr>
+        <w:pStyle w:val="ListParagraph"/>
+        <w:numPr>
+          <w:ilvl w:val="0"/>
+          <w:numId w:val="9"/>
+        </w:numPr>
+        <w:rPr>
+          <w:rFonts w:ascii="Segoe UI" w:hAnsi="Segoe UI" w:cs="Segoe UI"/>
+          <w:color w:val="000000" w:themeColor="text1"/>
+          <w:sz w:val="20"/>
+          <w:szCs w:val="20"/>
+        </w:rPr>
+      </w:pPr>
+      <w:r>
+        <w:rPr>
+          <w:rFonts w:ascii="Segoe UI" w:hAnsi="Segoe UI" w:cs="Segoe UI"/>
+          <w:color w:val="000000" w:themeColor="text1"/>
+          <w:sz w:val="20"/>
+          <w:szCs w:val="20"/>
+        </w:rPr>
+        <w:t>A dispatcher will review and confirm each recommendation rather than auto-send it</w:t>
+      </w:r>
+    </w:p>
+    <w:p>
+      <w:pPr>
+        <w:pStyle w:val="ListParagraph"/>
+        <w:numPr>
+          <w:ilvl w:val="0"/>
+          <w:numId w:val="9"/>
+        </w:numPr>
+        <w:rPr>
+          <w:rFonts w:ascii="Segoe UI" w:hAnsi="Segoe UI" w:cs="Segoe UI"/>
+          <w:color w:val="000000" w:themeColor="text1"/>
+          <w:sz w:val="20"/>
+          <w:szCs w:val="20"/>
+        </w:rPr>
+      </w:pPr>
+      <w:r>
+        <w:rPr>
+          <w:rFonts w:ascii="Segoe UI" w:hAnsi="Segoe UI" w:cs="Segoe UI"/>
+          <w:color w:val="000000" w:themeColor="text1"/>
+          <w:sz w:val="20"/>
+          <w:szCs w:val="20"/>
+        </w:rPr>
+        <w:t>Cost = pieces × per-piece rate (no transport or rework fees)</w:t>
+      </w:r>
+    </w:p>
+    <w:p>
+      <w:pPr>
+        <w:rPr>
+          <w:rFonts w:ascii="Segoe UI" w:hAnsi="Segoe UI" w:cs="Segoe UI"/>
+          <w:color w:val="000000" w:themeColor="text1"/>
+          <w:sz w:val="20"/>
+          <w:szCs w:val="20"/>
+        </w:rPr>
+      </w:pPr>
+    </w:p>
+    <w:p>
+      <w:pPr>
+        <w:rPr>
+          <w:rFonts w:ascii="Segoe UI" w:hAnsi="Segoe UI" w:cs="Segoe UI"/>
+          <w:b/>
+          <w:bCs/>
+          <w:color w:val="000000" w:themeColor="text1"/>
+          <w:sz w:val="20"/>
+          <w:szCs w:val="20"/>
+        </w:rPr>
+      </w:pPr>
+      <w:r>
+        <w:rPr>
+          <w:rFonts w:ascii="Segoe UI" w:hAnsi="Segoe UI" w:cs="Segoe UI"/>
+          <w:b/>
+          <w:bCs/>
+          <w:color w:val="000000" w:themeColor="text1"/>
+          <w:sz w:val="20"/>
+          <w:szCs w:val="20"/>
+        </w:rPr>
+        <w:t>Sprint 2 development roadmap</w:t>
+      </w:r>
+    </w:p>
+    <w:p>
+      <w:pPr>
+        <w:rPr>
+          <w:rFonts w:ascii="Segoe UI" w:hAnsi="Segoe UI" w:cs="Segoe UI"/>
+          <w:color w:val="CCCCCC"/>
+          <w:sz w:val="20"/>
+          <w:szCs w:val="20"/>
+        </w:rPr>
+      </w:pPr>
+    </w:p>
+    <w:p/>
+    <w:tbl>
+      <w:tblPr>
+        <w:tblW w:w="0" w:type="auto"/>
+        <w:tblCellMar>
+          <w:top w:w="15" w:type="dxa"/>
+          <w:left w:w="15" w:type="dxa"/>
+          <w:bottom w:w="15" w:type="dxa"/>
+          <w:right w:w="15" w:type="dxa"/>
+        </w:tblCellMar>
+        <w:tblLook w:val="04A0" w:firstRow="1" w:lastRow="0" w:firstColumn="1" w:lastColumn="0" w:noHBand="0" w:noVBand="1"/>
+      </w:tblPr>
+      <w:tblGrid>
+        <w:gridCol w:w="2917"/>
+        <w:gridCol w:w="764"/>
+        <w:gridCol w:w="5345"/>
+      </w:tblGrid>
+      <w:tr>
+        <w:trPr>
+          <w:tblHeader/>
+        </w:trPr>
+        <w:tc>
+          <w:tcPr>
+            <w:tcW w:w="0" w:type="auto"/>
+            <w:tcMar>
+              <w:top w:w="30" w:type="dxa"/>
+              <w:left w:w="30" w:type="dxa"/>
+              <w:bottom w:w="30" w:type="dxa"/>
+              <w:right w:w="30" w:type="dxa"/>
+            </w:tcMar>
+            <w:vAlign w:val="center"/>
+            <w:hideMark/>
+          </w:tcPr>
+          <w:p>
+            <w:pPr>
+              <w:jc w:val="center"/>
+              <w:rPr>
+                <w:rFonts w:ascii="Segoe UI" w:hAnsi="Segoe UI" w:cs="Segoe UI"/>
+                <w:b/>
+                <w:bCs/>
+                <w:color w:val="000000" w:themeColor="text1"/>
+                <w:sz w:val="20"/>
+                <w:szCs w:val="20"/>
+              </w:rPr>
+            </w:pPr>
+            <w:r>
+              <w:rPr>
+                <w:rFonts w:ascii="Segoe UI" w:hAnsi="Segoe UI" w:cs="Segoe UI"/>
+                <w:b/>
+                <w:bCs/>
+                <w:color w:val="000000" w:themeColor="text1"/>
+                <w:sz w:val="20"/>
+                <w:szCs w:val="20"/>
+              </w:rPr>
+              <w:t>Area</w:t>
+            </w:r>
+          </w:p>
+        </w:tc>
+        <w:tc>
+          <w:tcPr>
+            <w:tcW w:w="0" w:type="auto"/>
+            <w:tcMar>
+              <w:top w:w="30" w:type="dxa"/>
+              <w:left w:w="30" w:type="dxa"/>
+              <w:bottom w:w="30" w:type="dxa"/>
+              <w:right w:w="30" w:type="dxa"/>
+            </w:tcMar>
+            <w:vAlign w:val="center"/>
+            <w:hideMark/>
+          </w:tcPr>
+          <w:p>
+            <w:pPr>
+              <w:jc w:val="center"/>
+              <w:rPr>
+                <w:rFonts w:ascii="Segoe UI" w:hAnsi="Segoe UI" w:cs="Segoe UI"/>
+                <w:b/>
+                <w:bCs/>
+                <w:color w:val="000000" w:themeColor="text1"/>
+                <w:sz w:val="20"/>
+                <w:szCs w:val="20"/>
+              </w:rPr>
+            </w:pPr>
+            <w:r>
+              <w:rPr>
+                <w:rFonts w:ascii="Segoe UI" w:hAnsi="Segoe UI" w:cs="Segoe UI"/>
+                <w:b/>
+                <w:bCs/>
+                <w:color w:val="000000" w:themeColor="text1"/>
+                <w:sz w:val="20"/>
+                <w:szCs w:val="20"/>
+              </w:rPr>
+              <w:t>Priority</w:t>
+            </w:r>
+          </w:p>
+        </w:tc>
+        <w:tc>
+          <w:tcPr>
+            <w:tcW w:w="0" w:type="auto"/>
+            <w:tcMar>
+              <w:top w:w="30" w:type="dxa"/>
+              <w:left w:w="30" w:type="dxa"/>
+              <w:bottom w:w="30" w:type="dxa"/>
+              <w:right w:w="30" w:type="dxa"/>
+            </w:tcMar>
+            <w:vAlign w:val="center"/>
+            <w:hideMark/>
+          </w:tcPr>
+          <w:p>
+            <w:pPr>
+              <w:jc w:val="center"/>
+              <w:rPr>
+                <w:rFonts w:ascii="Segoe UI" w:hAnsi="Segoe UI" w:cs="Segoe UI"/>
+                <w:b/>
+                <w:bCs/>
+                <w:color w:val="000000" w:themeColor="text1"/>
+                <w:sz w:val="20"/>
+                <w:szCs w:val="20"/>
+              </w:rPr>
+            </w:pPr>
+            <w:r>
+              <w:rPr>
+                <w:rFonts w:ascii="Segoe UI" w:hAnsi="Segoe UI" w:cs="Segoe UI"/>
+                <w:b/>
+                <w:bCs/>
+                <w:color w:val="000000" w:themeColor="text1"/>
+                <w:sz w:val="20"/>
+                <w:szCs w:val="20"/>
+              </w:rPr>
+              <w:t>Description</w:t>
+            </w:r>
+          </w:p>
+        </w:tc>
+      </w:tr>
+      <w:tr>
+        <w:tc>
+          <w:tcPr>
+            <w:tcW w:w="0" w:type="auto"/>
+            <w:tcMar>
+              <w:top w:w="30" w:type="dxa"/>
+              <w:left w:w="30" w:type="dxa"/>
+              <w:bottom w:w="30" w:type="dxa"/>
+              <w:right w:w="30" w:type="dxa"/>
+            </w:tcMar>
+            <w:vAlign w:val="center"/>
+            <w:hideMark/>
+          </w:tcPr>
+          <w:p>
+            <w:pPr>
+              <w:rPr>
+                <w:rFonts w:ascii="Segoe UI" w:hAnsi="Segoe UI" w:cs="Segoe UI"/>
+                <w:color w:val="000000" w:themeColor="text1"/>
+                <w:sz w:val="20"/>
+                <w:szCs w:val="20"/>
+              </w:rPr>
+            </w:pPr>
+            <w:r>
+              <w:rPr>
+                <w:rFonts w:ascii="Segoe UI" w:hAnsi="Segoe UI" w:cs="Segoe UI"/>
+                <w:color w:val="000000" w:themeColor="text1"/>
+                <w:sz w:val="20"/>
+                <w:szCs w:val="20"/>
+              </w:rPr>
+              <w:t>Human labelling of the 30 requests</w:t>
+            </w:r>
+          </w:p>
+        </w:tc>
+        <w:tc>
+          <w:tcPr>
+            <w:tcW w:w="0" w:type="auto"/>
+            <w:tcMar>
+              <w:top w:w="30" w:type="dxa"/>
+              <w:left w:w="30" w:type="dxa"/>
+              <w:bottom w:w="30" w:type="dxa"/>
+              <w:right w:w="30" w:type="dxa"/>
+            </w:tcMar>
+            <w:vAlign w:val="center"/>
+            <w:hideMark/>
+          </w:tcPr>
+          <w:p>
+            <w:pPr>
+              <w:rPr>
+                <w:rFonts w:ascii="Segoe UI" w:hAnsi="Segoe UI" w:cs="Segoe UI"/>
+                <w:color w:val="000000" w:themeColor="text1"/>
+                <w:sz w:val="20"/>
+                <w:szCs w:val="20"/>
+              </w:rPr>
+            </w:pPr>
+            <w:r>
+              <w:rPr>
+                <w:rFonts w:ascii="Segoe UI" w:hAnsi="Segoe UI" w:cs="Segoe UI"/>
+                <w:color w:val="000000" w:themeColor="text1"/>
+                <w:sz w:val="20"/>
+                <w:szCs w:val="20"/>
+              </w:rPr>
+              <w:t>High</w:t>
+            </w:r>
+          </w:p>
+        </w:tc>
+        <w:tc>
+          <w:tcPr>
+            <w:tcW w:w="0" w:type="auto"/>
+            <w:tcMar>
+              <w:top w:w="30" w:type="dxa"/>
+              <w:left w:w="30" w:type="dxa"/>
+              <w:bottom w:w="30" w:type="dxa"/>
+              <w:right w:w="30" w:type="dxa"/>
+            </w:tcMar>
+            <w:vAlign w:val="center"/>
+            <w:hideMark/>
+          </w:tcPr>
+          <w:p>
+            <w:pPr>
+              <w:rPr>
+                <w:rFonts w:ascii="Segoe UI" w:hAnsi="Segoe UI" w:cs="Segoe UI"/>
+                <w:color w:val="000000" w:themeColor="text1"/>
+                <w:sz w:val="20"/>
+                <w:szCs w:val="20"/>
+              </w:rPr>
+            </w:pPr>
+            <w:r>
+              <w:rPr>
+                <w:rFonts w:ascii="Segoe UI" w:hAnsi="Segoe UI" w:cs="Segoe UI"/>
+                <w:color w:val="000000" w:themeColor="text1"/>
+                <w:sz w:val="20"/>
+                <w:szCs w:val="20"/>
+              </w:rPr>
+              <w:t>Two reviewers label independently, then reconcile (</w:t>
+            </w:r>
+            <w:r>
+              <w:rPr>
+                <w:rStyle w:val="HTMLCode"/>
+                <w:color w:val="000000" w:themeColor="text1"/>
+                <w:sz w:val="18"/>
+                <w:szCs w:val="18"/>
+              </w:rPr>
+              <w:t>eval/</w:t>
+            </w:r>
+            <w:proofErr w:type="spellStart"/>
+            <w:r>
+              <w:rPr>
+                <w:rStyle w:val="HTMLCode"/>
+                <w:color w:val="000000" w:themeColor="text1"/>
+                <w:sz w:val="18"/>
+                <w:szCs w:val="18"/>
+              </w:rPr>
+              <w:t>labeling</w:t>
+            </w:r>
+            <w:proofErr w:type="spellEnd"/>
+            <w:r>
+              <w:rPr>
+                <w:rStyle w:val="HTMLCode"/>
+                <w:color w:val="000000" w:themeColor="text1"/>
+                <w:sz w:val="18"/>
+                <w:szCs w:val="18"/>
+              </w:rPr>
+              <w:t>/</w:t>
+            </w:r>
+            <w:r>
+              <w:rPr>
+                <w:rFonts w:ascii="Segoe UI" w:hAnsi="Segoe UI" w:cs="Segoe UI"/>
+                <w:color w:val="000000" w:themeColor="text1"/>
+                <w:sz w:val="20"/>
+                <w:szCs w:val="20"/>
+              </w:rPr>
+              <w:t>)</w:t>
+            </w:r>
+          </w:p>
+        </w:tc>
+      </w:tr>
+      <w:tr>
+        <w:tc>
+          <w:tcPr>
+            <w:tcW w:w="0" w:type="auto"/>
+            <w:tcMar>
+              <w:top w:w="30" w:type="dxa"/>
+              <w:left w:w="30" w:type="dxa"/>
+              <w:bottom w:w="30" w:type="dxa"/>
+              <w:right w:w="30" w:type="dxa"/>
+            </w:tcMar>
+            <w:vAlign w:val="center"/>
+            <w:hideMark/>
+          </w:tcPr>
+          <w:p>
+            <w:pPr>
+              <w:rPr>
+                <w:rFonts w:ascii="Segoe UI" w:hAnsi="Segoe UI" w:cs="Segoe UI"/>
+                <w:color w:val="000000" w:themeColor="text1"/>
+                <w:sz w:val="20"/>
+                <w:szCs w:val="20"/>
+              </w:rPr>
+            </w:pPr>
+            <w:r>
+              <w:rPr>
+                <w:rFonts w:ascii="Segoe UI" w:hAnsi="Segoe UI" w:cs="Segoe UI"/>
+                <w:color w:val="000000" w:themeColor="text1"/>
+                <w:sz w:val="20"/>
+                <w:szCs w:val="20"/>
+              </w:rPr>
+              <w:lastRenderedPageBreak/>
+              <w:t>Live inbox evaluation</w:t>
+            </w:r>
+          </w:p>
+        </w:tc>
+        <w:tc>
+          <w:tcPr>
+            <w:tcW w:w="0" w:type="auto"/>
+            <w:tcMar>
+              <w:top w:w="30" w:type="dxa"/>
+              <w:left w:w="30" w:type="dxa"/>
+              <w:bottom w:w="30" w:type="dxa"/>
+              <w:right w:w="30" w:type="dxa"/>
+            </w:tcMar>
+            <w:vAlign w:val="center"/>
+            <w:hideMark/>
+          </w:tcPr>
+          <w:p>
+            <w:pPr>
+              <w:rPr>
+                <w:rFonts w:ascii="Segoe UI" w:hAnsi="Segoe UI" w:cs="Segoe UI"/>
+                <w:color w:val="000000" w:themeColor="text1"/>
+                <w:sz w:val="20"/>
+                <w:szCs w:val="20"/>
+              </w:rPr>
+            </w:pPr>
+            <w:r>
+              <w:rPr>
+                <w:rFonts w:ascii="Segoe UI" w:hAnsi="Segoe UI" w:cs="Segoe UI"/>
+                <w:color w:val="000000" w:themeColor="text1"/>
+                <w:sz w:val="20"/>
+                <w:szCs w:val="20"/>
+              </w:rPr>
+              <w:t>High</w:t>
+            </w:r>
+          </w:p>
+        </w:tc>
+        <w:tc>
+          <w:tcPr>
+            <w:tcW w:w="0" w:type="auto"/>
+            <w:tcMar>
+              <w:top w:w="30" w:type="dxa"/>
+              <w:left w:w="30" w:type="dxa"/>
+              <w:bottom w:w="30" w:type="dxa"/>
+              <w:right w:w="30" w:type="dxa"/>
+            </w:tcMar>
+            <w:vAlign w:val="center"/>
+            <w:hideMark/>
+          </w:tcPr>
+          <w:p>
+            <w:pPr>
+              <w:rPr>
+                <w:rFonts w:ascii="Segoe UI" w:hAnsi="Segoe UI" w:cs="Segoe UI"/>
+                <w:color w:val="000000" w:themeColor="text1"/>
+                <w:sz w:val="20"/>
+                <w:szCs w:val="20"/>
+              </w:rPr>
+            </w:pPr>
+            <w:r>
+              <w:rPr>
+                <w:rFonts w:ascii="Segoe UI" w:hAnsi="Segoe UI" w:cs="Segoe UI"/>
+                <w:color w:val="000000" w:themeColor="text1"/>
+                <w:sz w:val="20"/>
+                <w:szCs w:val="20"/>
+              </w:rPr>
+              <w:t>Run all 30 requests through the live LLM; score the decision and the explanation separately</w:t>
+            </w:r>
+          </w:p>
+        </w:tc>
+      </w:tr>
+      <w:tr>
+        <w:tc>
+          <w:tcPr>
+            <w:tcW w:w="0" w:type="auto"/>
+            <w:tcMar>
+              <w:top w:w="30" w:type="dxa"/>
+              <w:left w:w="30" w:type="dxa"/>
+              <w:bottom w:w="30" w:type="dxa"/>
+              <w:right w:w="30" w:type="dxa"/>
+            </w:tcMar>
+            <w:vAlign w:val="center"/>
+            <w:hideMark/>
+          </w:tcPr>
+          <w:p>
+            <w:pPr>
+              <w:rPr>
+                <w:rFonts w:ascii="Segoe UI" w:hAnsi="Segoe UI" w:cs="Segoe UI"/>
+                <w:color w:val="000000" w:themeColor="text1"/>
+                <w:sz w:val="20"/>
+                <w:szCs w:val="20"/>
+              </w:rPr>
+            </w:pPr>
+            <w:r>
+              <w:rPr>
+                <w:rFonts w:ascii="Segoe UI" w:hAnsi="Segoe UI" w:cs="Segoe UI"/>
+                <w:color w:val="000000" w:themeColor="text1"/>
+                <w:sz w:val="20"/>
+                <w:szCs w:val="20"/>
+              </w:rPr>
+              <w:t>Held-out test set</w:t>
+            </w:r>
+          </w:p>
+        </w:tc>
+        <w:tc>
+          <w:tcPr>
+            <w:tcW w:w="0" w:type="auto"/>
+            <w:tcMar>
+              <w:top w:w="30" w:type="dxa"/>
+              <w:left w:w="30" w:type="dxa"/>
+              <w:bottom w:w="30" w:type="dxa"/>
+              <w:right w:w="30" w:type="dxa"/>
+            </w:tcMar>
+            <w:vAlign w:val="center"/>
+            <w:hideMark/>
+          </w:tcPr>
+          <w:p>
+            <w:pPr>
+              <w:rPr>
+                <w:rFonts w:ascii="Segoe UI" w:hAnsi="Segoe UI" w:cs="Segoe UI"/>
+                <w:color w:val="000000" w:themeColor="text1"/>
+                <w:sz w:val="20"/>
+                <w:szCs w:val="20"/>
+              </w:rPr>
+            </w:pPr>
+            <w:r>
+              <w:rPr>
+                <w:rFonts w:ascii="Segoe UI" w:hAnsi="Segoe UI" w:cs="Segoe UI"/>
+                <w:color w:val="000000" w:themeColor="text1"/>
+                <w:sz w:val="20"/>
+                <w:szCs w:val="20"/>
+              </w:rPr>
+              <w:t>High</w:t>
+            </w:r>
+          </w:p>
+        </w:tc>
+        <w:tc>
+          <w:tcPr>
+            <w:tcW w:w="0" w:type="auto"/>
+            <w:tcMar>
+              <w:top w:w="30" w:type="dxa"/>
+              <w:left w:w="30" w:type="dxa"/>
+              <w:bottom w:w="30" w:type="dxa"/>
+              <w:right w:w="30" w:type="dxa"/>
+            </w:tcMar>
+            <w:vAlign w:val="center"/>
+            <w:hideMark/>
+          </w:tcPr>
+          <w:p>
+            <w:pPr>
+              <w:rPr>
+                <w:rFonts w:ascii="Segoe UI" w:hAnsi="Segoe UI" w:cs="Segoe UI"/>
+                <w:color w:val="000000" w:themeColor="text1"/>
+                <w:sz w:val="20"/>
+                <w:szCs w:val="20"/>
+              </w:rPr>
+            </w:pPr>
+            <w:r>
+              <w:rPr>
+                <w:rFonts w:ascii="Segoe UI" w:hAnsi="Segoe UI" w:cs="Segoe UI"/>
+                <w:color w:val="000000" w:themeColor="text1"/>
+                <w:sz w:val="20"/>
+                <w:szCs w:val="20"/>
+              </w:rPr>
+              <w:t>Write 10+ new unseen chat requests so we don't tune on the evaluation set</w:t>
+            </w:r>
+          </w:p>
+        </w:tc>
+      </w:tr>
+      <w:tr>
+        <w:tc>
+          <w:tcPr>
+            <w:tcW w:w="0" w:type="auto"/>
+            <w:tcMar>
+              <w:top w:w="30" w:type="dxa"/>
+              <w:left w:w="30" w:type="dxa"/>
+              <w:bottom w:w="30" w:type="dxa"/>
+              <w:right w:w="30" w:type="dxa"/>
+            </w:tcMar>
+            <w:vAlign w:val="center"/>
+            <w:hideMark/>
+          </w:tcPr>
+          <w:p>
+            <w:pPr>
+              <w:rPr>
+                <w:rFonts w:ascii="Segoe UI" w:hAnsi="Segoe UI" w:cs="Segoe UI"/>
+                <w:b/>
+                <w:bCs/>
+                <w:color w:val="000000" w:themeColor="text1"/>
+                <w:sz w:val="20"/>
+                <w:szCs w:val="20"/>
+              </w:rPr>
+            </w:pPr>
+            <w:r>
+              <w:rPr>
+                <w:rStyle w:val="Strong"/>
+                <w:rFonts w:ascii="Segoe UI" w:hAnsi="Segoe UI" w:cs="Segoe UI"/>
+                <w:b w:val="0"/>
+                <w:bCs w:val="0"/>
+                <w:color w:val="000000" w:themeColor="text1"/>
+                <w:sz w:val="20"/>
+                <w:szCs w:val="20"/>
+              </w:rPr>
+              <w:t>Demo online</w:t>
+            </w:r>
+          </w:p>
+        </w:tc>
+        <w:tc>
+          <w:tcPr>
+            <w:tcW w:w="0" w:type="auto"/>
+            <w:tcMar>
+              <w:top w:w="30" w:type="dxa"/>
+              <w:left w:w="30" w:type="dxa"/>
+              <w:bottom w:w="30" w:type="dxa"/>
+              <w:right w:w="30" w:type="dxa"/>
+            </w:tcMar>
+            <w:vAlign w:val="center"/>
+            <w:hideMark/>
+          </w:tcPr>
+          <w:p>
+            <w:pPr>
+              <w:rPr>
+                <w:rFonts w:ascii="Segoe UI" w:hAnsi="Segoe UI" w:cs="Segoe UI"/>
+                <w:b/>
+                <w:bCs/>
+                <w:color w:val="000000" w:themeColor="text1"/>
+                <w:sz w:val="20"/>
+                <w:szCs w:val="20"/>
+              </w:rPr>
+            </w:pPr>
+            <w:r>
+              <w:rPr>
+                <w:rStyle w:val="Strong"/>
+                <w:rFonts w:ascii="Segoe UI" w:hAnsi="Segoe UI" w:cs="Segoe UI"/>
+                <w:b w:val="0"/>
+                <w:bCs w:val="0"/>
+                <w:color w:val="000000" w:themeColor="text1"/>
+                <w:sz w:val="20"/>
+                <w:szCs w:val="20"/>
+              </w:rPr>
+              <w:t>High</w:t>
+            </w:r>
+          </w:p>
+        </w:tc>
+        <w:tc>
+          <w:tcPr>
+            <w:tcW w:w="0" w:type="auto"/>
+            <w:tcMar>
+              <w:top w:w="30" w:type="dxa"/>
+              <w:left w:w="30" w:type="dxa"/>
+              <w:bottom w:w="30" w:type="dxa"/>
+              <w:right w:w="30" w:type="dxa"/>
+            </w:tcMar>
+            <w:vAlign w:val="center"/>
+            <w:hideMark/>
+          </w:tcPr>
+          <w:p>
+            <w:pPr>
+              <w:rPr>
+                <w:rFonts w:ascii="Segoe UI" w:hAnsi="Segoe UI" w:cs="Segoe UI"/>
+                <w:b/>
+                <w:bCs/>
+                <w:color w:val="000000" w:themeColor="text1"/>
+                <w:sz w:val="20"/>
+                <w:szCs w:val="20"/>
+              </w:rPr>
+            </w:pPr>
+            <w:r>
+              <w:rPr>
+                <w:rStyle w:val="Strong"/>
+                <w:rFonts w:ascii="Segoe UI" w:hAnsi="Segoe UI" w:cs="Segoe UI"/>
+                <w:b w:val="0"/>
+                <w:bCs w:val="0"/>
+                <w:color w:val="000000" w:themeColor="text1"/>
+                <w:sz w:val="20"/>
+                <w:szCs w:val="20"/>
+              </w:rPr>
+              <w:t xml:space="preserve">Deploy the app to </w:t>
+            </w:r>
+            <w:proofErr w:type="spellStart"/>
+            <w:r>
+              <w:rPr>
+                <w:rStyle w:val="Strong"/>
+                <w:rFonts w:ascii="Segoe UI" w:hAnsi="Segoe UI" w:cs="Segoe UI"/>
+                <w:b w:val="0"/>
+                <w:bCs w:val="0"/>
+                <w:color w:val="000000" w:themeColor="text1"/>
+                <w:sz w:val="20"/>
+                <w:szCs w:val="20"/>
+              </w:rPr>
+              <w:t>Streamlit</w:t>
+            </w:r>
+            <w:proofErr w:type="spellEnd"/>
+            <w:r>
+              <w:rPr>
+                <w:rStyle w:val="Strong"/>
+                <w:rFonts w:ascii="Segoe UI" w:hAnsi="Segoe UI" w:cs="Segoe UI"/>
+                <w:b w:val="0"/>
+                <w:bCs w:val="0"/>
+                <w:color w:val="000000" w:themeColor="text1"/>
+                <w:sz w:val="20"/>
+                <w:szCs w:val="20"/>
+              </w:rPr>
+              <w:t xml:space="preserve"> Cloud; make the GitHub repo public; check both links work</w:t>
+            </w:r>
+          </w:p>
+        </w:tc>
+      </w:tr>
+      <w:tr>
+        <w:tc>
+          <w:tcPr>
+            <w:tcW w:w="0" w:type="auto"/>
+            <w:tcMar>
+              <w:top w:w="30" w:type="dxa"/>
+              <w:left w:w="30" w:type="dxa"/>
+              <w:bottom w:w="30" w:type="dxa"/>
+              <w:right w:w="30" w:type="dxa"/>
+            </w:tcMar>
+            <w:vAlign w:val="center"/>
+            <w:hideMark/>
+          </w:tcPr>
+          <w:p>
+            <w:pPr>
+              <w:rPr>
+                <w:rFonts w:ascii="Segoe UI" w:hAnsi="Segoe UI" w:cs="Segoe UI"/>
+                <w:color w:val="000000" w:themeColor="text1"/>
+                <w:sz w:val="20"/>
+                <w:szCs w:val="20"/>
+              </w:rPr>
+            </w:pPr>
+            <w:r>
+              <w:rPr>
+                <w:rFonts w:ascii="Segoe UI" w:hAnsi="Segoe UI" w:cs="Segoe UI"/>
+                <w:color w:val="000000" w:themeColor="text1"/>
+                <w:sz w:val="20"/>
+                <w:szCs w:val="20"/>
+              </w:rPr>
+              <w:t>Sprint 2 video and demo</w:t>
+            </w:r>
+          </w:p>
+        </w:tc>
+        <w:tc>
+          <w:tcPr>
+            <w:tcW w:w="0" w:type="auto"/>
+            <w:tcMar>
+              <w:top w:w="30" w:type="dxa"/>
+              <w:left w:w="30" w:type="dxa"/>
+              <w:bottom w:w="30" w:type="dxa"/>
+              <w:right w:w="30" w:type="dxa"/>
+            </w:tcMar>
+            <w:vAlign w:val="center"/>
+            <w:hideMark/>
+          </w:tcPr>
+          <w:p>
+            <w:pPr>
+              <w:rPr>
+                <w:rFonts w:ascii="Segoe UI" w:hAnsi="Segoe UI" w:cs="Segoe UI"/>
+                <w:color w:val="000000" w:themeColor="text1"/>
+                <w:sz w:val="20"/>
+                <w:szCs w:val="20"/>
+              </w:rPr>
+            </w:pPr>
+            <w:r>
+              <w:rPr>
+                <w:rStyle w:val="Strong"/>
+                <w:rFonts w:ascii="Segoe UI" w:hAnsi="Segoe UI" w:cs="Segoe UI"/>
+                <w:b w:val="0"/>
+                <w:bCs w:val="0"/>
+                <w:color w:val="000000" w:themeColor="text1"/>
+                <w:sz w:val="20"/>
+                <w:szCs w:val="20"/>
+              </w:rPr>
+              <w:t>High</w:t>
+            </w:r>
+          </w:p>
+        </w:tc>
+        <w:tc>
+          <w:tcPr>
+            <w:tcW w:w="0" w:type="auto"/>
+            <w:tcMar>
+              <w:top w:w="30" w:type="dxa"/>
+              <w:left w:w="30" w:type="dxa"/>
+              <w:bottom w:w="30" w:type="dxa"/>
+              <w:right w:w="30" w:type="dxa"/>
+            </w:tcMar>
+            <w:vAlign w:val="center"/>
+            <w:hideMark/>
+          </w:tcPr>
+          <w:p>
+            <w:pPr>
+              <w:rPr>
+                <w:rFonts w:ascii="Segoe UI" w:hAnsi="Segoe UI" w:cs="Segoe UI"/>
+                <w:color w:val="000000" w:themeColor="text1"/>
+                <w:sz w:val="20"/>
+                <w:szCs w:val="20"/>
+              </w:rPr>
+            </w:pPr>
+            <w:r>
+              <w:rPr>
+                <w:rFonts w:ascii="Segoe UI" w:hAnsi="Segoe UI" w:cs="Segoe UI"/>
+                <w:color w:val="000000" w:themeColor="text1"/>
+                <w:sz w:val="20"/>
+                <w:szCs w:val="20"/>
+              </w:rPr>
+              <w:t>5-minute video covering the objective, the tech and a live demo</w:t>
+            </w:r>
+          </w:p>
+        </w:tc>
+      </w:tr>
+      <w:tr>
+        <w:tc>
+          <w:tcPr>
+            <w:tcW w:w="0" w:type="auto"/>
+            <w:tcMar>
+              <w:top w:w="30" w:type="dxa"/>
+              <w:left w:w="30" w:type="dxa"/>
+              <w:bottom w:w="30" w:type="dxa"/>
+              <w:right w:w="30" w:type="dxa"/>
+            </w:tcMar>
+            <w:vAlign w:val="center"/>
+            <w:hideMark/>
+          </w:tcPr>
+          <w:p>
+            <w:pPr>
+              <w:rPr>
+                <w:rFonts w:ascii="Segoe UI" w:hAnsi="Segoe UI" w:cs="Segoe UI"/>
+                <w:color w:val="000000" w:themeColor="text1"/>
+                <w:sz w:val="20"/>
+                <w:szCs w:val="20"/>
+              </w:rPr>
+            </w:pPr>
+            <w:r>
+              <w:rPr>
+                <w:rFonts w:ascii="Segoe UI" w:hAnsi="Segoe UI" w:cs="Segoe UI"/>
+                <w:color w:val="000000" w:themeColor="text1"/>
+                <w:sz w:val="20"/>
+                <w:szCs w:val="20"/>
+              </w:rPr>
+              <w:t>Dispatcher UI polish</w:t>
+            </w:r>
+          </w:p>
+        </w:tc>
+        <w:tc>
+          <w:tcPr>
+            <w:tcW w:w="0" w:type="auto"/>
+            <w:tcMar>
+              <w:top w:w="30" w:type="dxa"/>
+              <w:left w:w="30" w:type="dxa"/>
+              <w:bottom w:w="30" w:type="dxa"/>
+              <w:right w:w="30" w:type="dxa"/>
+            </w:tcMar>
+            <w:vAlign w:val="center"/>
+            <w:hideMark/>
+          </w:tcPr>
+          <w:p>
+            <w:pPr>
+              <w:rPr>
+                <w:rFonts w:ascii="Segoe UI" w:hAnsi="Segoe UI" w:cs="Segoe UI"/>
+                <w:color w:val="000000" w:themeColor="text1"/>
+                <w:sz w:val="20"/>
+                <w:szCs w:val="20"/>
+              </w:rPr>
+            </w:pPr>
+            <w:r>
+              <w:rPr>
+                <w:rFonts w:ascii="Segoe UI" w:hAnsi="Segoe UI" w:cs="Segoe UI"/>
+                <w:color w:val="000000" w:themeColor="text1"/>
+                <w:sz w:val="20"/>
+                <w:szCs w:val="20"/>
+              </w:rPr>
+              <w:t>Med</w:t>
+            </w:r>
+          </w:p>
+        </w:tc>
+        <w:tc>
+          <w:tcPr>
+            <w:tcW w:w="0" w:type="auto"/>
+            <w:tcMar>
+              <w:top w:w="30" w:type="dxa"/>
+              <w:left w:w="30" w:type="dxa"/>
+              <w:bottom w:w="30" w:type="dxa"/>
+              <w:right w:w="30" w:type="dxa"/>
+            </w:tcMar>
+            <w:vAlign w:val="center"/>
+            <w:hideMark/>
+          </w:tcPr>
+          <w:p>
+            <w:pPr>
+              <w:rPr>
+                <w:rFonts w:ascii="Segoe UI" w:hAnsi="Segoe UI" w:cs="Segoe UI"/>
+                <w:color w:val="000000" w:themeColor="text1"/>
+                <w:sz w:val="20"/>
+                <w:szCs w:val="20"/>
+              </w:rPr>
+            </w:pPr>
+            <w:r>
+              <w:rPr>
+                <w:rFonts w:ascii="Segoe UI" w:hAnsi="Segoe UI" w:cs="Segoe UI"/>
+                <w:color w:val="000000" w:themeColor="text1"/>
+                <w:sz w:val="20"/>
+                <w:szCs w:val="20"/>
+              </w:rPr>
+              <w:t>Recommendation, candidates and ETAs visible at a glance; faster confirm flow</w:t>
+            </w:r>
+          </w:p>
+        </w:tc>
+      </w:tr>
+      <w:tr>
+        <w:tc>
+          <w:tcPr>
+            <w:tcW w:w="0" w:type="auto"/>
+            <w:tcMar>
+              <w:top w:w="30" w:type="dxa"/>
+              <w:left w:w="30" w:type="dxa"/>
+              <w:bottom w:w="30" w:type="dxa"/>
+              <w:right w:w="30" w:type="dxa"/>
+            </w:tcMar>
+            <w:vAlign w:val="center"/>
+            <w:hideMark/>
+          </w:tcPr>
+          <w:p>
+            <w:pPr>
+              <w:rPr>
+                <w:rFonts w:ascii="Segoe UI" w:hAnsi="Segoe UI" w:cs="Segoe UI"/>
+                <w:color w:val="000000" w:themeColor="text1"/>
+                <w:sz w:val="20"/>
+                <w:szCs w:val="20"/>
+              </w:rPr>
+            </w:pPr>
+            <w:r>
+              <w:rPr>
+                <w:rFonts w:ascii="Segoe UI" w:hAnsi="Segoe UI" w:cs="Segoe UI"/>
+                <w:color w:val="000000" w:themeColor="text1"/>
+                <w:sz w:val="20"/>
+                <w:szCs w:val="20"/>
+              </w:rPr>
+              <w:t>Remember the follow-up conversation</w:t>
+            </w:r>
+          </w:p>
+        </w:tc>
+        <w:tc>
+          <w:tcPr>
+            <w:tcW w:w="0" w:type="auto"/>
+            <w:tcMar>
+              <w:top w:w="30" w:type="dxa"/>
+              <w:left w:w="30" w:type="dxa"/>
+              <w:bottom w:w="30" w:type="dxa"/>
+              <w:right w:w="30" w:type="dxa"/>
+            </w:tcMar>
+            <w:vAlign w:val="center"/>
+            <w:hideMark/>
+          </w:tcPr>
+          <w:p>
+            <w:pPr>
+              <w:rPr>
+                <w:rFonts w:ascii="Segoe UI" w:hAnsi="Segoe UI" w:cs="Segoe UI"/>
+                <w:color w:val="000000" w:themeColor="text1"/>
+                <w:sz w:val="20"/>
+                <w:szCs w:val="20"/>
+              </w:rPr>
+            </w:pPr>
+            <w:r>
+              <w:rPr>
+                <w:rFonts w:ascii="Segoe UI" w:hAnsi="Segoe UI" w:cs="Segoe UI"/>
+                <w:color w:val="000000" w:themeColor="text1"/>
+                <w:sz w:val="20"/>
+                <w:szCs w:val="20"/>
+              </w:rPr>
+              <w:t>Med</w:t>
+            </w:r>
+          </w:p>
+        </w:tc>
+        <w:tc>
+          <w:tcPr>
+            <w:tcW w:w="0" w:type="auto"/>
+            <w:tcMar>
+              <w:top w:w="30" w:type="dxa"/>
+              <w:left w:w="30" w:type="dxa"/>
+              <w:bottom w:w="30" w:type="dxa"/>
+              <w:right w:w="30" w:type="dxa"/>
+            </w:tcMar>
+            <w:vAlign w:val="center"/>
+            <w:hideMark/>
+          </w:tcPr>
+          <w:p>
+            <w:pPr>
+              <w:rPr>
+                <w:rFonts w:ascii="Segoe UI" w:hAnsi="Segoe UI" w:cs="Segoe UI"/>
+                <w:color w:val="000000" w:themeColor="text1"/>
+                <w:sz w:val="20"/>
+                <w:szCs w:val="20"/>
+              </w:rPr>
+            </w:pPr>
+            <w:r>
+              <w:rPr>
+                <w:rFonts w:ascii="Segoe UI" w:hAnsi="Segoe UI" w:cs="Segoe UI"/>
+                <w:color w:val="000000" w:themeColor="text1"/>
+                <w:sz w:val="20"/>
+                <w:szCs w:val="20"/>
+              </w:rPr>
+              <w:t>When the user answers a follow-up question, combine the reply with the original message</w:t>
+            </w:r>
+          </w:p>
+        </w:tc>
+      </w:tr>
+      <w:tr>
+        <w:tc>
+          <w:tcPr>
+            <w:tcW w:w="0" w:type="auto"/>
+            <w:tcMar>
+              <w:top w:w="30" w:type="dxa"/>
+              <w:left w:w="30" w:type="dxa"/>
+              <w:bottom w:w="30" w:type="dxa"/>
+              <w:right w:w="30" w:type="dxa"/>
+            </w:tcMar>
+            <w:vAlign w:val="center"/>
+            <w:hideMark/>
+          </w:tcPr>
+          <w:p>
+            <w:pPr>
+              <w:rPr>
+                <w:rFonts w:ascii="Segoe UI" w:hAnsi="Segoe UI" w:cs="Segoe UI"/>
+                <w:color w:val="000000" w:themeColor="text1"/>
+                <w:sz w:val="20"/>
+                <w:szCs w:val="20"/>
+              </w:rPr>
+            </w:pPr>
+            <w:r>
+              <w:rPr>
+                <w:rFonts w:ascii="Segoe UI" w:hAnsi="Segoe UI" w:cs="Segoe UI"/>
+                <w:color w:val="000000" w:themeColor="text1"/>
+                <w:sz w:val="20"/>
+                <w:szCs w:val="20"/>
+              </w:rPr>
+              <w:t>Let the dispatcher choose a different workshop</w:t>
+            </w:r>
+          </w:p>
+        </w:tc>
+        <w:tc>
+          <w:tcPr>
+            <w:tcW w:w="0" w:type="auto"/>
+            <w:tcMar>
+              <w:top w:w="30" w:type="dxa"/>
+              <w:left w:w="30" w:type="dxa"/>
+              <w:bottom w:w="30" w:type="dxa"/>
+              <w:right w:w="30" w:type="dxa"/>
+            </w:tcMar>
+            <w:vAlign w:val="center"/>
+            <w:hideMark/>
+          </w:tcPr>
+          <w:p>
+            <w:pPr>
+              <w:rPr>
+                <w:rFonts w:ascii="Segoe UI" w:hAnsi="Segoe UI" w:cs="Segoe UI"/>
+                <w:color w:val="000000" w:themeColor="text1"/>
+                <w:sz w:val="20"/>
+                <w:szCs w:val="20"/>
+              </w:rPr>
+            </w:pPr>
+            <w:r>
+              <w:rPr>
+                <w:rFonts w:ascii="Segoe UI" w:hAnsi="Segoe UI" w:cs="Segoe UI"/>
+                <w:color w:val="000000" w:themeColor="text1"/>
+                <w:sz w:val="20"/>
+                <w:szCs w:val="20"/>
+              </w:rPr>
+              <w:t>Low</w:t>
+            </w:r>
+          </w:p>
+        </w:tc>
+        <w:tc>
+          <w:tcPr>
+            <w:tcW w:w="0" w:type="auto"/>
+            <w:tcMar>
+              <w:top w:w="30" w:type="dxa"/>
+              <w:left w:w="30" w:type="dxa"/>
+              <w:bottom w:w="30" w:type="dxa"/>
+              <w:right w:w="30" w:type="dxa"/>
+            </w:tcMar>
+            <w:vAlign w:val="center"/>
+            <w:hideMark/>
+          </w:tcPr>
+          <w:p>
+            <w:pPr>
+              <w:rPr>
+                <w:rFonts w:ascii="Segoe UI" w:hAnsi="Segoe UI" w:cs="Segoe UI"/>
+                <w:color w:val="000000" w:themeColor="text1"/>
+                <w:sz w:val="20"/>
+                <w:szCs w:val="20"/>
+              </w:rPr>
+            </w:pPr>
+            <w:r>
+              <w:rPr>
+                <w:rFonts w:ascii="Segoe UI" w:hAnsi="Segoe UI" w:cs="Segoe UI"/>
+                <w:color w:val="000000" w:themeColor="text1"/>
+                <w:sz w:val="20"/>
+                <w:szCs w:val="20"/>
+              </w:rPr>
+              <w:t>Add an override option, with the reason saved in the log</w:t>
+            </w:r>
+          </w:p>
+        </w:tc>
+      </w:tr>
+      <w:tr>
+        <w:tc>
+          <w:tcPr>
+            <w:tcW w:w="0" w:type="auto"/>
+            <w:tcMar>
+              <w:top w:w="30" w:type="dxa"/>
+              <w:left w:w="30" w:type="dxa"/>
+              <w:bottom w:w="30" w:type="dxa"/>
+              <w:right w:w="30" w:type="dxa"/>
+            </w:tcMar>
+            <w:vAlign w:val="center"/>
+            <w:hideMark/>
+          </w:tcPr>
+          <w:p>
+            <w:pPr>
+              <w:rPr>
+                <w:rFonts w:ascii="Segoe UI" w:hAnsi="Segoe UI" w:cs="Segoe UI"/>
+                <w:color w:val="000000" w:themeColor="text1"/>
+                <w:sz w:val="20"/>
+                <w:szCs w:val="20"/>
+              </w:rPr>
+            </w:pPr>
+            <w:r>
+              <w:rPr>
+                <w:rFonts w:ascii="Segoe UI" w:hAnsi="Segoe UI" w:cs="Segoe UI"/>
+                <w:color w:val="000000" w:themeColor="text1"/>
+                <w:sz w:val="20"/>
+                <w:szCs w:val="20"/>
+              </w:rPr>
+              <w:t>Measure response time</w:t>
+            </w:r>
+          </w:p>
+        </w:tc>
+        <w:tc>
+          <w:tcPr>
+            <w:tcW w:w="0" w:type="auto"/>
+            <w:tcMar>
+              <w:top w:w="30" w:type="dxa"/>
+              <w:left w:w="30" w:type="dxa"/>
+              <w:bottom w:w="30" w:type="dxa"/>
+              <w:right w:w="30" w:type="dxa"/>
+            </w:tcMar>
+            <w:vAlign w:val="center"/>
+            <w:hideMark/>
+          </w:tcPr>
+          <w:p>
+            <w:pPr>
+              <w:rPr>
+                <w:rFonts w:ascii="Segoe UI" w:hAnsi="Segoe UI" w:cs="Segoe UI"/>
+                <w:color w:val="000000" w:themeColor="text1"/>
+                <w:sz w:val="20"/>
+                <w:szCs w:val="20"/>
+              </w:rPr>
+            </w:pPr>
+            <w:r>
+              <w:rPr>
+                <w:rFonts w:ascii="Segoe UI" w:hAnsi="Segoe UI" w:cs="Segoe UI"/>
+                <w:color w:val="000000" w:themeColor="text1"/>
+                <w:sz w:val="20"/>
+                <w:szCs w:val="20"/>
+              </w:rPr>
+              <w:t>Low</w:t>
+            </w:r>
+          </w:p>
+        </w:tc>
+        <w:tc>
+          <w:tcPr>
+            <w:tcW w:w="0" w:type="auto"/>
+            <w:tcMar>
+              <w:top w:w="30" w:type="dxa"/>
+              <w:left w:w="30" w:type="dxa"/>
+              <w:bottom w:w="30" w:type="dxa"/>
+              <w:right w:w="30" w:type="dxa"/>
+            </w:tcMar>
+            <w:vAlign w:val="center"/>
+            <w:hideMark/>
+          </w:tcPr>
+          <w:p>
+            <w:pPr>
+              <w:rPr>
+                <w:rFonts w:ascii="Segoe UI" w:hAnsi="Segoe UI" w:cs="Segoe UI"/>
+                <w:color w:val="000000" w:themeColor="text1"/>
+                <w:sz w:val="20"/>
+                <w:szCs w:val="20"/>
+              </w:rPr>
+            </w:pPr>
+            <w:r>
+              <w:rPr>
+                <w:rFonts w:ascii="Segoe UI" w:hAnsi="Segoe UI" w:cs="Segoe UI"/>
+                <w:color w:val="000000" w:themeColor="text1"/>
+                <w:sz w:val="20"/>
+                <w:szCs w:val="20"/>
+              </w:rPr>
+              <w:t>Time each request from message to recommendation</w:t>
+            </w:r>
+          </w:p>
+        </w:tc>
+      </w:tr>
+    </w:tbl>
+    <w:p>
+      <w:pPr>
+        <w:shd w:val="clear" w:color="auto" w:fill="FFFFFF" w:themeFill="background1"/>
+        <w:rPr>
+          <w:color w:val="000000" w:themeColor="text1"/>
+          <w:lang w:val="en-US"/>
+        </w:rPr>
+      </w:pPr>
+    </w:p>
+    <w:p>
+      <w:pPr>
+        <w:pStyle w:val="Heading3"/>
+        <w:shd w:val="clear" w:color="auto" w:fill="FFFFFF" w:themeFill="background1"/>
+        <w:rPr>
+          <w:rFonts w:ascii="Segoe UI" w:eastAsia="Times New Roman" w:hAnsi="Segoe UI" w:cs="Segoe UI"/>
+          <w:b/>
+          <w:bCs/>
+          <w:color w:val="000000" w:themeColor="text1"/>
+          <w:sz w:val="27"/>
+          <w:szCs w:val="27"/>
+        </w:rPr>
+      </w:pPr>
+      <w:r>
+        <w:rPr>
+          <w:color w:val="000000" w:themeColor="text1"/>
+          <w:lang w:val="en-US"/>
+        </w:rPr>
+        <w:t xml:space="preserve">Success Criteria </w:t>
       </w:r>
       <w:r>
         <w:rPr>
-          <w:rFonts w:ascii="Segoe UI" w:hAnsi="Segoe UI" w:cs="Segoe UI"/>
-          <w:color w:val="000000" w:themeColor="text1"/>
-          <w:sz w:val="20"/>
-          <w:szCs w:val="20"/>
-        </w:rPr>
-        <w:t xml:space="preserve"> (course simulator, 120 orders, average of 10 runs)</w:t>
+          <w:color w:val="000000" w:themeColor="text1"/>
+          <w:lang w:val="en-US"/>
+        </w:rPr>
+        <w:br/>
+      </w:r>
+      <w:r>
+        <w:rPr>
+          <w:rFonts w:ascii="Segoe UI" w:eastAsia="Times New Roman" w:hAnsi="Segoe UI" w:cs="Segoe UI"/>
+          <w:b/>
+          <w:bCs/>
+          <w:color w:val="000000" w:themeColor="text1"/>
+          <w:sz w:val="27"/>
+          <w:szCs w:val="27"/>
+        </w:rPr>
+        <w:t>Proving the chat side works</w:t>
       </w:r>
     </w:p>
     <w:tbl>
@@ -1821,9 +3124,9 @@
         <w:tblLook w:val="04A0" w:firstRow="1" w:lastRow="0" w:firstColumn="1" w:lastColumn="0" w:noHBand="0" w:noVBand="1"/>
       </w:tblPr>
       <w:tblGrid>
-        <w:gridCol w:w="3294"/>
-        <w:gridCol w:w="640"/>
-        <w:gridCol w:w="2518"/>
+        <w:gridCol w:w="1590"/>
+        <w:gridCol w:w="5601"/>
+        <w:gridCol w:w="1835"/>
       </w:tblGrid>
       <w:tr>
         <w:trPr>
@@ -1832,17 +3135,19 @@
         <w:tc>
           <w:tcPr>
             <w:tcW w:w="0" w:type="auto"/>
-            <w:tcMar>
-              <w:top w:w="30" w:type="dxa"/>
-              <w:left w:w="30" w:type="dxa"/>
-              <w:bottom w:w="30" w:type="dxa"/>
-              <w:right w:w="30" w:type="dxa"/>
-            </w:tcMar>
-            <w:vAlign w:val="center"/>
-            <w:hideMark/>
-          </w:tcPr>
-          <w:p>
-            <w:pPr>
+            <w:shd w:val="clear" w:color="auto" w:fill="FFFFFF" w:themeFill="background1"/>
+            <w:tcMar>
+              <w:top w:w="30" w:type="dxa"/>
+              <w:left w:w="30" w:type="dxa"/>
+              <w:bottom w:w="30" w:type="dxa"/>
+              <w:right w:w="30" w:type="dxa"/>
+            </w:tcMar>
+            <w:vAlign w:val="center"/>
+            <w:hideMark/>
+          </w:tcPr>
+          <w:p>
+            <w:pPr>
+              <w:shd w:val="clear" w:color="auto" w:fill="FFFFFF" w:themeFill="background1"/>
               <w:jc w:val="center"/>
               <w:rPr>
                 <w:rFonts w:ascii="Segoe UI" w:hAnsi="Segoe UI" w:cs="Segoe UI"/>
@@ -1862,24 +3167,26 @@
                 <w:sz w:val="20"/>
                 <w:szCs w:val="20"/>
               </w:rPr>
-              <w:t>Setting</w:t>
-            </w:r>
-          </w:p>
-        </w:tc>
-        <w:tc>
-          <w:tcPr>
-            <w:tcW w:w="0" w:type="auto"/>
-            <w:tcMar>
-              <w:top w:w="30" w:type="dxa"/>
-              <w:left w:w="30" w:type="dxa"/>
-              <w:bottom w:w="30" w:type="dxa"/>
-              <w:right w:w="30" w:type="dxa"/>
-            </w:tcMar>
-            <w:vAlign w:val="center"/>
-            <w:hideMark/>
-          </w:tcPr>
-          <w:p>
-            <w:pPr>
+              <w:t>Roadmap item</w:t>
+            </w:r>
+          </w:p>
+        </w:tc>
+        <w:tc>
+          <w:tcPr>
+            <w:tcW w:w="0" w:type="auto"/>
+            <w:shd w:val="clear" w:color="auto" w:fill="FFFFFF" w:themeFill="background1"/>
+            <w:tcMar>
+              <w:top w:w="30" w:type="dxa"/>
+              <w:left w:w="30" w:type="dxa"/>
+              <w:bottom w:w="30" w:type="dxa"/>
+              <w:right w:w="30" w:type="dxa"/>
+            </w:tcMar>
+            <w:vAlign w:val="center"/>
+            <w:hideMark/>
+          </w:tcPr>
+          <w:p>
+            <w:pPr>
+              <w:shd w:val="clear" w:color="auto" w:fill="FFFFFF" w:themeFill="background1"/>
               <w:jc w:val="center"/>
               <w:rPr>
                 <w:rFonts w:ascii="Segoe UI" w:hAnsi="Segoe UI" w:cs="Segoe UI"/>
@@ -1899,24 +3206,26 @@
                 <w:sz w:val="20"/>
                 <w:szCs w:val="20"/>
               </w:rPr>
-              <w:t>% late</w:t>
-            </w:r>
-          </w:p>
-        </w:tc>
-        <w:tc>
-          <w:tcPr>
-            <w:tcW w:w="0" w:type="auto"/>
-            <w:tcMar>
-              <w:top w:w="30" w:type="dxa"/>
-              <w:left w:w="30" w:type="dxa"/>
-              <w:bottom w:w="30" w:type="dxa"/>
-              <w:right w:w="30" w:type="dxa"/>
-            </w:tcMar>
-            <w:vAlign w:val="center"/>
-            <w:hideMark/>
-          </w:tcPr>
-          <w:p>
-            <w:pPr>
+              <w:t>Success looks like</w:t>
+            </w:r>
+          </w:p>
+        </w:tc>
+        <w:tc>
+          <w:tcPr>
+            <w:tcW w:w="0" w:type="auto"/>
+            <w:shd w:val="clear" w:color="auto" w:fill="FFFFFF" w:themeFill="background1"/>
+            <w:tcMar>
+              <w:top w:w="30" w:type="dxa"/>
+              <w:left w:w="30" w:type="dxa"/>
+              <w:bottom w:w="30" w:type="dxa"/>
+              <w:right w:w="30" w:type="dxa"/>
+            </w:tcMar>
+            <w:vAlign w:val="center"/>
+            <w:hideMark/>
+          </w:tcPr>
+          <w:p>
+            <w:pPr>
+              <w:shd w:val="clear" w:color="auto" w:fill="FFFFFF" w:themeFill="background1"/>
               <w:jc w:val="center"/>
               <w:rPr>
                 <w:rFonts w:ascii="Segoe UI" w:hAnsi="Segoe UI" w:cs="Segoe UI"/>
@@ -1936,7 +3245,7 @@
                 <w:sz w:val="20"/>
                 <w:szCs w:val="20"/>
               </w:rPr>
-              <w:t>Max share (lower = fairer)</w:t>
+              <w:t>Target</w:t>
             </w:r>
           </w:p>
         </w:tc>
@@ -1945,98 +3254,104 @@
         <w:tc>
           <w:tcPr>
             <w:tcW w:w="0" w:type="auto"/>
-            <w:tcMar>
-              <w:top w:w="30" w:type="dxa"/>
-              <w:left w:w="30" w:type="dxa"/>
-              <w:bottom w:w="30" w:type="dxa"/>
-              <w:right w:w="30" w:type="dxa"/>
-            </w:tcMar>
-            <w:vAlign w:val="center"/>
-            <w:hideMark/>
-          </w:tcPr>
-          <w:p>
-            <w:pPr>
-              <w:rPr>
-                <w:rFonts w:ascii="Segoe UI" w:hAnsi="Segoe UI" w:cs="Segoe UI"/>
-                <w:color w:val="000000" w:themeColor="text1"/>
-                <w:sz w:val="20"/>
-                <w:szCs w:val="20"/>
-              </w:rPr>
-            </w:pPr>
-            <w:r>
-              <w:rPr>
-                <w:rStyle w:val="Strong"/>
-                <w:rFonts w:ascii="Segoe UI" w:hAnsi="Segoe UI" w:cs="Segoe UI"/>
-                <w:color w:val="000000" w:themeColor="text1"/>
-                <w:sz w:val="20"/>
-                <w:szCs w:val="20"/>
-              </w:rPr>
-              <w:t>Lateness (primary)</w:t>
-            </w:r>
-          </w:p>
-        </w:tc>
-        <w:tc>
-          <w:tcPr>
-            <w:tcW w:w="0" w:type="auto"/>
-            <w:tcMar>
-              <w:top w:w="30" w:type="dxa"/>
-              <w:left w:w="30" w:type="dxa"/>
-              <w:bottom w:w="30" w:type="dxa"/>
-              <w:right w:w="30" w:type="dxa"/>
-            </w:tcMar>
-            <w:vAlign w:val="center"/>
-            <w:hideMark/>
-          </w:tcPr>
-          <w:p>
-            <w:pPr>
-              <w:rPr>
-                <w:rFonts w:ascii="Segoe UI" w:hAnsi="Segoe UI" w:cs="Segoe UI"/>
-                <w:color w:val="000000" w:themeColor="text1"/>
-                <w:sz w:val="20"/>
-                <w:szCs w:val="20"/>
-              </w:rPr>
-            </w:pPr>
-            <w:r>
-              <w:rPr>
-                <w:rStyle w:val="Strong"/>
-                <w:rFonts w:ascii="Segoe UI" w:hAnsi="Segoe UI" w:cs="Segoe UI"/>
-                <w:color w:val="000000" w:themeColor="text1"/>
-                <w:sz w:val="20"/>
-                <w:szCs w:val="20"/>
-              </w:rPr>
-              <w:t>1.7%</w:t>
-            </w:r>
-          </w:p>
-        </w:tc>
-        <w:tc>
-          <w:tcPr>
-            <w:tcW w:w="0" w:type="auto"/>
-            <w:tcMar>
-              <w:top w:w="30" w:type="dxa"/>
-              <w:left w:w="30" w:type="dxa"/>
-              <w:bottom w:w="30" w:type="dxa"/>
-              <w:right w:w="30" w:type="dxa"/>
-            </w:tcMar>
-            <w:vAlign w:val="center"/>
-            <w:hideMark/>
-          </w:tcPr>
-          <w:p>
-            <w:pPr>
-              <w:rPr>
-                <w:rFonts w:ascii="Segoe UI" w:hAnsi="Segoe UI" w:cs="Segoe UI"/>
-                <w:color w:val="000000" w:themeColor="text1"/>
-                <w:sz w:val="20"/>
-                <w:szCs w:val="20"/>
-              </w:rPr>
-            </w:pPr>
-            <w:r>
-              <w:rPr>
-                <w:rFonts w:ascii="Segoe UI" w:hAnsi="Segoe UI" w:cs="Segoe UI"/>
-                <w:color w:val="000000" w:themeColor="text1"/>
-                <w:sz w:val="20"/>
-                <w:szCs w:val="20"/>
-              </w:rPr>
-              <w:t>26.3%</w:t>
+            <w:shd w:val="clear" w:color="auto" w:fill="FFFFFF" w:themeFill="background1"/>
+            <w:tcMar>
+              <w:top w:w="30" w:type="dxa"/>
+              <w:left w:w="30" w:type="dxa"/>
+              <w:bottom w:w="30" w:type="dxa"/>
+              <w:right w:w="30" w:type="dxa"/>
+            </w:tcMar>
+            <w:vAlign w:val="center"/>
+            <w:hideMark/>
+          </w:tcPr>
+          <w:p>
+            <w:pPr>
+              <w:shd w:val="clear" w:color="auto" w:fill="FFFFFF" w:themeFill="background1"/>
+              <w:rPr>
+                <w:rFonts w:ascii="Segoe UI" w:hAnsi="Segoe UI" w:cs="Segoe UI"/>
+                <w:color w:val="000000" w:themeColor="text1"/>
+                <w:sz w:val="20"/>
+                <w:szCs w:val="20"/>
+              </w:rPr>
+            </w:pPr>
+            <w:r>
+              <w:rPr>
+                <w:rFonts w:ascii="Segoe UI" w:hAnsi="Segoe UI" w:cs="Segoe UI"/>
+                <w:b/>
+                <w:bCs/>
+                <w:color w:val="000000" w:themeColor="text1"/>
+                <w:sz w:val="20"/>
+                <w:szCs w:val="20"/>
+              </w:rPr>
+              <w:t>Human labelling</w:t>
+            </w:r>
+          </w:p>
+        </w:tc>
+        <w:tc>
+          <w:tcPr>
+            <w:tcW w:w="0" w:type="auto"/>
+            <w:shd w:val="clear" w:color="auto" w:fill="FFFFFF" w:themeFill="background1"/>
+            <w:tcMar>
+              <w:top w:w="30" w:type="dxa"/>
+              <w:left w:w="30" w:type="dxa"/>
+              <w:bottom w:w="30" w:type="dxa"/>
+              <w:right w:w="30" w:type="dxa"/>
+            </w:tcMar>
+            <w:vAlign w:val="center"/>
+            <w:hideMark/>
+          </w:tcPr>
+          <w:p>
+            <w:pPr>
+              <w:shd w:val="clear" w:color="auto" w:fill="FFFFFF" w:themeFill="background1"/>
+              <w:rPr>
+                <w:rFonts w:ascii="Segoe UI" w:hAnsi="Segoe UI" w:cs="Segoe UI"/>
+                <w:color w:val="000000" w:themeColor="text1"/>
+                <w:sz w:val="20"/>
+                <w:szCs w:val="20"/>
+              </w:rPr>
+            </w:pPr>
+            <w:r>
+              <w:rPr>
+                <w:rFonts w:ascii="Segoe UI" w:hAnsi="Segoe UI" w:cs="Segoe UI"/>
+                <w:color w:val="000000" w:themeColor="text1"/>
+                <w:sz w:val="20"/>
+                <w:szCs w:val="20"/>
+              </w:rPr>
+              <w:t>All 30 requests labelled by two reviewers, with disagreements resolved</w:t>
+            </w:r>
+          </w:p>
+        </w:tc>
+        <w:tc>
+          <w:tcPr>
+            <w:tcW w:w="0" w:type="auto"/>
+            <w:shd w:val="clear" w:color="auto" w:fill="FFFFFF" w:themeFill="background1"/>
+            <w:tcMar>
+              <w:top w:w="30" w:type="dxa"/>
+              <w:left w:w="30" w:type="dxa"/>
+              <w:bottom w:w="30" w:type="dxa"/>
+              <w:right w:w="30" w:type="dxa"/>
+            </w:tcMar>
+            <w:vAlign w:val="center"/>
+            <w:hideMark/>
+          </w:tcPr>
+          <w:p>
+            <w:pPr>
+              <w:shd w:val="clear" w:color="auto" w:fill="FFFFFF" w:themeFill="background1"/>
+              <w:rPr>
+                <w:rFonts w:ascii="Segoe UI" w:hAnsi="Segoe UI" w:cs="Segoe UI"/>
+                <w:color w:val="000000" w:themeColor="text1"/>
+                <w:sz w:val="20"/>
+                <w:szCs w:val="20"/>
+              </w:rPr>
+            </w:pPr>
+            <w:r>
+              <w:rPr>
+                <w:rFonts w:ascii="Segoe UI" w:hAnsi="Segoe UI" w:cs="Segoe UI"/>
+                <w:color w:val="000000" w:themeColor="text1"/>
+                <w:sz w:val="20"/>
+                <w:szCs w:val="20"/>
+              </w:rPr>
+              <w:t>30/30 labelled</w:t>
             </w:r>
           </w:p>
         </w:tc>
@@ -2045,96 +3360,106 @@
         <w:tc>
           <w:tcPr>
             <w:tcW w:w="0" w:type="auto"/>
-            <w:tcMar>
-              <w:top w:w="30" w:type="dxa"/>
-              <w:left w:w="30" w:type="dxa"/>
-              <w:bottom w:w="30" w:type="dxa"/>
-              <w:right w:w="30" w:type="dxa"/>
-            </w:tcMar>
-            <w:vAlign w:val="center"/>
-            <w:hideMark/>
-          </w:tcPr>
-          <w:p>
-            <w:pPr>
-              <w:rPr>
-                <w:rFonts w:ascii="Segoe UI" w:hAnsi="Segoe UI" w:cs="Segoe UI"/>
-                <w:color w:val="000000" w:themeColor="text1"/>
-                <w:sz w:val="20"/>
-                <w:szCs w:val="20"/>
-              </w:rPr>
-            </w:pPr>
-            <w:r>
-              <w:rPr>
-                <w:rFonts w:ascii="Segoe UI" w:hAnsi="Segoe UI" w:cs="Segoe UI"/>
-                <w:color w:val="000000" w:themeColor="text1"/>
-                <w:sz w:val="20"/>
-                <w:szCs w:val="20"/>
-              </w:rPr>
-              <w:t>Fairness (other objective)</w:t>
-            </w:r>
-          </w:p>
-        </w:tc>
-        <w:tc>
-          <w:tcPr>
-            <w:tcW w:w="0" w:type="auto"/>
-            <w:tcMar>
-              <w:top w:w="30" w:type="dxa"/>
-              <w:left w:w="30" w:type="dxa"/>
-              <w:bottom w:w="30" w:type="dxa"/>
-              <w:right w:w="30" w:type="dxa"/>
-            </w:tcMar>
-            <w:vAlign w:val="center"/>
-            <w:hideMark/>
-          </w:tcPr>
-          <w:p>
-            <w:pPr>
-              <w:rPr>
-                <w:rFonts w:ascii="Segoe UI" w:hAnsi="Segoe UI" w:cs="Segoe UI"/>
-                <w:color w:val="000000" w:themeColor="text1"/>
-                <w:sz w:val="20"/>
-                <w:szCs w:val="20"/>
-              </w:rPr>
-            </w:pPr>
-            <w:r>
-              <w:rPr>
-                <w:rFonts w:ascii="Segoe UI" w:hAnsi="Segoe UI" w:cs="Segoe UI"/>
-                <w:color w:val="000000" w:themeColor="text1"/>
-                <w:sz w:val="20"/>
-                <w:szCs w:val="20"/>
-              </w:rPr>
-              <w:t>24.4%</w:t>
-            </w:r>
-          </w:p>
-        </w:tc>
-        <w:tc>
-          <w:tcPr>
-            <w:tcW w:w="0" w:type="auto"/>
-            <w:tcMar>
-              <w:top w:w="30" w:type="dxa"/>
-              <w:left w:w="30" w:type="dxa"/>
-              <w:bottom w:w="30" w:type="dxa"/>
-              <w:right w:w="30" w:type="dxa"/>
-            </w:tcMar>
-            <w:vAlign w:val="center"/>
-            <w:hideMark/>
-          </w:tcPr>
-          <w:p>
-            <w:pPr>
-              <w:rPr>
-                <w:rFonts w:ascii="Segoe UI" w:hAnsi="Segoe UI" w:cs="Segoe UI"/>
-                <w:color w:val="000000" w:themeColor="text1"/>
-                <w:sz w:val="20"/>
-                <w:szCs w:val="20"/>
-              </w:rPr>
-            </w:pPr>
-            <w:r>
-              <w:rPr>
-                <w:rFonts w:ascii="Segoe UI" w:hAnsi="Segoe UI" w:cs="Segoe UI"/>
-                <w:color w:val="000000" w:themeColor="text1"/>
-                <w:sz w:val="20"/>
-                <w:szCs w:val="20"/>
-              </w:rPr>
-              <w:t>17.5%</w:t>
+            <w:shd w:val="clear" w:color="auto" w:fill="FFFFFF" w:themeFill="background1"/>
+            <w:tcMar>
+              <w:top w:w="30" w:type="dxa"/>
+              <w:left w:w="30" w:type="dxa"/>
+              <w:bottom w:w="30" w:type="dxa"/>
+              <w:right w:w="30" w:type="dxa"/>
+            </w:tcMar>
+            <w:vAlign w:val="center"/>
+            <w:hideMark/>
+          </w:tcPr>
+          <w:p>
+            <w:pPr>
+              <w:shd w:val="clear" w:color="auto" w:fill="FFFFFF" w:themeFill="background1"/>
+              <w:rPr>
+                <w:rFonts w:ascii="Segoe UI" w:hAnsi="Segoe UI" w:cs="Segoe UI"/>
+                <w:color w:val="000000" w:themeColor="text1"/>
+                <w:sz w:val="20"/>
+                <w:szCs w:val="20"/>
+              </w:rPr>
+            </w:pPr>
+            <w:r>
+              <w:rPr>
+                <w:rFonts w:ascii="Segoe UI" w:hAnsi="Segoe UI" w:cs="Segoe UI"/>
+                <w:b/>
+                <w:bCs/>
+                <w:color w:val="000000" w:themeColor="text1"/>
+                <w:sz w:val="20"/>
+                <w:szCs w:val="20"/>
+              </w:rPr>
+              <w:t>Live inbox evaluation</w:t>
+            </w:r>
+          </w:p>
+        </w:tc>
+        <w:tc>
+          <w:tcPr>
+            <w:tcW w:w="0" w:type="auto"/>
+            <w:shd w:val="clear" w:color="auto" w:fill="FFFFFF" w:themeFill="background1"/>
+            <w:tcMar>
+              <w:top w:w="30" w:type="dxa"/>
+              <w:left w:w="30" w:type="dxa"/>
+              <w:bottom w:w="30" w:type="dxa"/>
+              <w:right w:w="30" w:type="dxa"/>
+            </w:tcMar>
+            <w:vAlign w:val="center"/>
+            <w:hideMark/>
+          </w:tcPr>
+          <w:p>
+            <w:pPr>
+              <w:shd w:val="clear" w:color="auto" w:fill="FFFFFF" w:themeFill="background1"/>
+              <w:rPr>
+                <w:rFonts w:ascii="Segoe UI" w:hAnsi="Segoe UI" w:cs="Segoe UI"/>
+                <w:color w:val="000000" w:themeColor="text1"/>
+                <w:sz w:val="20"/>
+                <w:szCs w:val="20"/>
+              </w:rPr>
+            </w:pPr>
+            <w:r>
+              <w:rPr>
+                <w:rFonts w:ascii="Segoe UI" w:hAnsi="Segoe UI" w:cs="Segoe UI"/>
+                <w:color w:val="000000" w:themeColor="text1"/>
+                <w:sz w:val="20"/>
+                <w:szCs w:val="20"/>
+              </w:rPr>
+              <w:t>Correct response overall (recommend / ask / refuse / can't answer)</w:t>
+            </w:r>
+          </w:p>
+        </w:tc>
+        <w:tc>
+          <w:tcPr>
+            <w:tcW w:w="0" w:type="auto"/>
+            <w:shd w:val="clear" w:color="auto" w:fill="FFFFFF" w:themeFill="background1"/>
+            <w:tcMar>
+              <w:top w:w="30" w:type="dxa"/>
+              <w:left w:w="30" w:type="dxa"/>
+              <w:bottom w:w="30" w:type="dxa"/>
+              <w:right w:w="30" w:type="dxa"/>
+            </w:tcMar>
+            <w:vAlign w:val="center"/>
+            <w:hideMark/>
+          </w:tcPr>
+          <w:p>
+            <w:pPr>
+              <w:shd w:val="clear" w:color="auto" w:fill="FFFFFF" w:themeFill="background1"/>
+              <w:rPr>
+                <w:rFonts w:ascii="Segoe UI" w:hAnsi="Segoe UI" w:cs="Segoe UI"/>
+                <w:color w:val="000000" w:themeColor="text1"/>
+                <w:sz w:val="20"/>
+                <w:szCs w:val="20"/>
+              </w:rPr>
+            </w:pPr>
+            <w:r>
+              <w:rPr>
+                <w:rFonts w:ascii="Segoe UI" w:hAnsi="Segoe UI" w:cs="Segoe UI"/>
+                <w:b/>
+                <w:bCs/>
+                <w:color w:val="000000" w:themeColor="text1"/>
+                <w:sz w:val="20"/>
+                <w:szCs w:val="20"/>
+              </w:rPr>
+              <w:t>At least 26 of 30 (85%)</w:t>
             </w:r>
           </w:p>
         </w:tc>
@@ -2143,96 +3468,93 @@
         <w:tc>
           <w:tcPr>
             <w:tcW w:w="0" w:type="auto"/>
-            <w:tcMar>
-              <w:top w:w="30" w:type="dxa"/>
-              <w:left w:w="30" w:type="dxa"/>
-              <w:bottom w:w="30" w:type="dxa"/>
-              <w:right w:w="30" w:type="dxa"/>
-            </w:tcMar>
-            <w:vAlign w:val="center"/>
-            <w:hideMark/>
-          </w:tcPr>
-          <w:p>
-            <w:pPr>
-              <w:rPr>
-                <w:rFonts w:ascii="Segoe UI" w:hAnsi="Segoe UI" w:cs="Segoe UI"/>
-                <w:color w:val="000000" w:themeColor="text1"/>
-                <w:sz w:val="20"/>
-                <w:szCs w:val="20"/>
-              </w:rPr>
-            </w:pPr>
-            <w:r>
-              <w:rPr>
-                <w:rFonts w:ascii="Segoe UI" w:hAnsi="Segoe UI" w:cs="Segoe UI"/>
-                <w:color w:val="000000" w:themeColor="text1"/>
-                <w:sz w:val="20"/>
-                <w:szCs w:val="20"/>
-              </w:rPr>
-              <w:t>70% lateness + 30% fairness (hybrid)</w:t>
-            </w:r>
-          </w:p>
-        </w:tc>
-        <w:tc>
-          <w:tcPr>
-            <w:tcW w:w="0" w:type="auto"/>
-            <w:tcMar>
-              <w:top w:w="30" w:type="dxa"/>
-              <w:left w:w="30" w:type="dxa"/>
-              <w:bottom w:w="30" w:type="dxa"/>
-              <w:right w:w="30" w:type="dxa"/>
-            </w:tcMar>
-            <w:vAlign w:val="center"/>
-            <w:hideMark/>
-          </w:tcPr>
-          <w:p>
-            <w:pPr>
-              <w:rPr>
-                <w:rFonts w:ascii="Segoe UI" w:hAnsi="Segoe UI" w:cs="Segoe UI"/>
-                <w:color w:val="000000" w:themeColor="text1"/>
-                <w:sz w:val="20"/>
-                <w:szCs w:val="20"/>
-              </w:rPr>
-            </w:pPr>
-            <w:r>
-              <w:rPr>
-                <w:rFonts w:ascii="Segoe UI" w:hAnsi="Segoe UI" w:cs="Segoe UI"/>
-                <w:color w:val="000000" w:themeColor="text1"/>
-                <w:sz w:val="20"/>
-                <w:szCs w:val="20"/>
-              </w:rPr>
-              <w:t>7.0%</w:t>
-            </w:r>
-          </w:p>
-        </w:tc>
-        <w:tc>
-          <w:tcPr>
-            <w:tcW w:w="0" w:type="auto"/>
-            <w:tcMar>
-              <w:top w:w="30" w:type="dxa"/>
-              <w:left w:w="30" w:type="dxa"/>
-              <w:bottom w:w="30" w:type="dxa"/>
-              <w:right w:w="30" w:type="dxa"/>
-            </w:tcMar>
-            <w:vAlign w:val="center"/>
-            <w:hideMark/>
-          </w:tcPr>
-          <w:p>
-            <w:pPr>
-              <w:rPr>
-                <w:rFonts w:ascii="Segoe UI" w:hAnsi="Segoe UI" w:cs="Segoe UI"/>
-                <w:color w:val="000000" w:themeColor="text1"/>
-                <w:sz w:val="20"/>
-                <w:szCs w:val="20"/>
-              </w:rPr>
-            </w:pPr>
-            <w:r>
-              <w:rPr>
-                <w:rFonts w:ascii="Segoe UI" w:hAnsi="Segoe UI" w:cs="Segoe UI"/>
-                <w:color w:val="000000" w:themeColor="text1"/>
-                <w:sz w:val="20"/>
-                <w:szCs w:val="20"/>
-              </w:rPr>
-              <w:t>20.5%</w:t>
+            <w:shd w:val="clear" w:color="auto" w:fill="FFFFFF" w:themeFill="background1"/>
+            <w:tcMar>
+              <w:top w:w="30" w:type="dxa"/>
+              <w:left w:w="30" w:type="dxa"/>
+              <w:bottom w:w="30" w:type="dxa"/>
+              <w:right w:w="30" w:type="dxa"/>
+            </w:tcMar>
+            <w:vAlign w:val="center"/>
+            <w:hideMark/>
+          </w:tcPr>
+          <w:p>
+            <w:pPr>
+              <w:shd w:val="clear" w:color="auto" w:fill="FFFFFF" w:themeFill="background1"/>
+              <w:rPr>
+                <w:rFonts w:ascii="Segoe UI" w:hAnsi="Segoe UI" w:cs="Segoe UI"/>
+                <w:color w:val="000000" w:themeColor="text1"/>
+                <w:sz w:val="20"/>
+                <w:szCs w:val="20"/>
+              </w:rPr>
+            </w:pPr>
+          </w:p>
+        </w:tc>
+        <w:tc>
+          <w:tcPr>
+            <w:tcW w:w="0" w:type="auto"/>
+            <w:shd w:val="clear" w:color="auto" w:fill="FFFFFF" w:themeFill="background1"/>
+            <w:tcMar>
+              <w:top w:w="30" w:type="dxa"/>
+              <w:left w:w="30" w:type="dxa"/>
+              <w:bottom w:w="30" w:type="dxa"/>
+              <w:right w:w="30" w:type="dxa"/>
+            </w:tcMar>
+            <w:vAlign w:val="center"/>
+            <w:hideMark/>
+          </w:tcPr>
+          <w:p>
+            <w:pPr>
+              <w:shd w:val="clear" w:color="auto" w:fill="FFFFFF" w:themeFill="background1"/>
+              <w:rPr>
+                <w:rFonts w:ascii="Segoe UI" w:hAnsi="Segoe UI" w:cs="Segoe UI"/>
+                <w:color w:val="000000" w:themeColor="text1"/>
+                <w:sz w:val="20"/>
+                <w:szCs w:val="20"/>
+              </w:rPr>
+            </w:pPr>
+            <w:r>
+              <w:rPr>
+                <w:rFonts w:ascii="Segoe UI" w:hAnsi="Segoe UI" w:cs="Segoe UI"/>
+                <w:color w:val="000000" w:themeColor="text1"/>
+                <w:sz w:val="20"/>
+                <w:szCs w:val="20"/>
+              </w:rPr>
+              <w:t>Unclear or incomplete requests: asks instead of guessing</w:t>
+            </w:r>
+          </w:p>
+        </w:tc>
+        <w:tc>
+          <w:tcPr>
+            <w:tcW w:w="0" w:type="auto"/>
+            <w:shd w:val="clear" w:color="auto" w:fill="FFFFFF" w:themeFill="background1"/>
+            <w:tcMar>
+              <w:top w:w="30" w:type="dxa"/>
+              <w:left w:w="30" w:type="dxa"/>
+              <w:bottom w:w="30" w:type="dxa"/>
+              <w:right w:w="30" w:type="dxa"/>
+            </w:tcMar>
+            <w:vAlign w:val="center"/>
+            <w:hideMark/>
+          </w:tcPr>
+          <w:p>
+            <w:pPr>
+              <w:shd w:val="clear" w:color="auto" w:fill="FFFFFF" w:themeFill="background1"/>
+              <w:rPr>
+                <w:rFonts w:ascii="Segoe UI" w:hAnsi="Segoe UI" w:cs="Segoe UI"/>
+                <w:color w:val="000000" w:themeColor="text1"/>
+                <w:sz w:val="20"/>
+                <w:szCs w:val="20"/>
+              </w:rPr>
+            </w:pPr>
+            <w:r>
+              <w:rPr>
+                <w:rFonts w:ascii="Segoe UI" w:hAnsi="Segoe UI" w:cs="Segoe UI"/>
+                <w:color w:val="000000" w:themeColor="text1"/>
+                <w:sz w:val="20"/>
+                <w:szCs w:val="20"/>
+              </w:rPr>
+              <w:t>7/7</w:t>
             </w:r>
           </w:p>
         </w:tc>
@@ -2241,96 +3563,1260 @@
         <w:tc>
           <w:tcPr>
             <w:tcW w:w="0" w:type="auto"/>
-            <w:tcMar>
-              <w:top w:w="30" w:type="dxa"/>
-              <w:left w:w="30" w:type="dxa"/>
-              <w:bottom w:w="30" w:type="dxa"/>
-              <w:right w:w="30" w:type="dxa"/>
-            </w:tcMar>
-            <w:vAlign w:val="center"/>
-            <w:hideMark/>
-          </w:tcPr>
-          <w:p>
-            <w:pPr>
-              <w:rPr>
-                <w:rFonts w:ascii="Segoe UI" w:hAnsi="Segoe UI" w:cs="Segoe UI"/>
-                <w:color w:val="000000" w:themeColor="text1"/>
-                <w:sz w:val="20"/>
-                <w:szCs w:val="20"/>
-              </w:rPr>
-            </w:pPr>
-            <w:r>
-              <w:rPr>
-                <w:rFonts w:ascii="Segoe UI" w:hAnsi="Segoe UI" w:cs="Segoe UI"/>
-                <w:color w:val="000000" w:themeColor="text1"/>
-                <w:sz w:val="20"/>
-                <w:szCs w:val="20"/>
-              </w:rPr>
-              <w:t>Random (for comparison)</w:t>
-            </w:r>
-          </w:p>
-        </w:tc>
-        <w:tc>
-          <w:tcPr>
-            <w:tcW w:w="0" w:type="auto"/>
-            <w:tcMar>
-              <w:top w:w="30" w:type="dxa"/>
-              <w:left w:w="30" w:type="dxa"/>
-              <w:bottom w:w="30" w:type="dxa"/>
-              <w:right w:w="30" w:type="dxa"/>
-            </w:tcMar>
-            <w:vAlign w:val="center"/>
-            <w:hideMark/>
-          </w:tcPr>
-          <w:p>
-            <w:pPr>
-              <w:rPr>
-                <w:rFonts w:ascii="Segoe UI" w:hAnsi="Segoe UI" w:cs="Segoe UI"/>
-                <w:color w:val="000000" w:themeColor="text1"/>
-                <w:sz w:val="20"/>
-                <w:szCs w:val="20"/>
-              </w:rPr>
-            </w:pPr>
-            <w:r>
-              <w:rPr>
-                <w:rFonts w:ascii="Segoe UI" w:hAnsi="Segoe UI" w:cs="Segoe UI"/>
-                <w:color w:val="000000" w:themeColor="text1"/>
-                <w:sz w:val="20"/>
-                <w:szCs w:val="20"/>
-              </w:rPr>
-              <w:t>34.2%</w:t>
-            </w:r>
-          </w:p>
-        </w:tc>
-        <w:tc>
-          <w:tcPr>
-            <w:tcW w:w="0" w:type="auto"/>
-            <w:tcMar>
-              <w:top w:w="30" w:type="dxa"/>
-              <w:left w:w="30" w:type="dxa"/>
-              <w:bottom w:w="30" w:type="dxa"/>
-              <w:right w:w="30" w:type="dxa"/>
-            </w:tcMar>
-            <w:vAlign w:val="center"/>
-            <w:hideMark/>
-          </w:tcPr>
-          <w:p>
-            <w:pPr>
-              <w:rPr>
-                <w:rFonts w:ascii="Segoe UI" w:hAnsi="Segoe UI" w:cs="Segoe UI"/>
-                <w:color w:val="000000" w:themeColor="text1"/>
-                <w:sz w:val="20"/>
-                <w:szCs w:val="20"/>
-              </w:rPr>
-            </w:pPr>
-            <w:r>
-              <w:rPr>
-                <w:rFonts w:ascii="Segoe UI" w:hAnsi="Segoe UI" w:cs="Segoe UI"/>
-                <w:color w:val="000000" w:themeColor="text1"/>
-                <w:sz w:val="20"/>
-                <w:szCs w:val="20"/>
-              </w:rPr>
-              <w:t>22.6%</w:t>
+            <w:shd w:val="clear" w:color="auto" w:fill="FFFFFF" w:themeFill="background1"/>
+            <w:tcMar>
+              <w:top w:w="30" w:type="dxa"/>
+              <w:left w:w="30" w:type="dxa"/>
+              <w:bottom w:w="30" w:type="dxa"/>
+              <w:right w:w="30" w:type="dxa"/>
+            </w:tcMar>
+            <w:vAlign w:val="center"/>
+            <w:hideMark/>
+          </w:tcPr>
+          <w:p>
+            <w:pPr>
+              <w:shd w:val="clear" w:color="auto" w:fill="FFFFFF" w:themeFill="background1"/>
+              <w:rPr>
+                <w:rFonts w:ascii="Segoe UI" w:hAnsi="Segoe UI" w:cs="Segoe UI"/>
+                <w:color w:val="000000" w:themeColor="text1"/>
+                <w:sz w:val="20"/>
+                <w:szCs w:val="20"/>
+              </w:rPr>
+            </w:pPr>
+          </w:p>
+        </w:tc>
+        <w:tc>
+          <w:tcPr>
+            <w:tcW w:w="0" w:type="auto"/>
+            <w:shd w:val="clear" w:color="auto" w:fill="FFFFFF" w:themeFill="background1"/>
+            <w:tcMar>
+              <w:top w:w="30" w:type="dxa"/>
+              <w:left w:w="30" w:type="dxa"/>
+              <w:bottom w:w="30" w:type="dxa"/>
+              <w:right w:w="30" w:type="dxa"/>
+            </w:tcMar>
+            <w:vAlign w:val="center"/>
+            <w:hideMark/>
+          </w:tcPr>
+          <w:p>
+            <w:pPr>
+              <w:shd w:val="clear" w:color="auto" w:fill="FFFFFF" w:themeFill="background1"/>
+              <w:rPr>
+                <w:rFonts w:ascii="Segoe UI" w:hAnsi="Segoe UI" w:cs="Segoe UI"/>
+                <w:color w:val="000000" w:themeColor="text1"/>
+                <w:sz w:val="20"/>
+                <w:szCs w:val="20"/>
+              </w:rPr>
+            </w:pPr>
+            <w:r>
+              <w:rPr>
+                <w:rFonts w:ascii="Segoe UI" w:hAnsi="Segoe UI" w:cs="Segoe UI"/>
+                <w:color w:val="000000" w:themeColor="text1"/>
+                <w:sz w:val="20"/>
+                <w:szCs w:val="20"/>
+              </w:rPr>
+              <w:t>Unsuitable workshop suggested: refuses with the right reason and offers an alternative</w:t>
+            </w:r>
+          </w:p>
+        </w:tc>
+        <w:tc>
+          <w:tcPr>
+            <w:tcW w:w="0" w:type="auto"/>
+            <w:shd w:val="clear" w:color="auto" w:fill="FFFFFF" w:themeFill="background1"/>
+            <w:tcMar>
+              <w:top w:w="30" w:type="dxa"/>
+              <w:left w:w="30" w:type="dxa"/>
+              <w:bottom w:w="30" w:type="dxa"/>
+              <w:right w:w="30" w:type="dxa"/>
+            </w:tcMar>
+            <w:vAlign w:val="center"/>
+            <w:hideMark/>
+          </w:tcPr>
+          <w:p>
+            <w:pPr>
+              <w:shd w:val="clear" w:color="auto" w:fill="FFFFFF" w:themeFill="background1"/>
+              <w:rPr>
+                <w:rFonts w:ascii="Segoe UI" w:hAnsi="Segoe UI" w:cs="Segoe UI"/>
+                <w:color w:val="000000" w:themeColor="text1"/>
+                <w:sz w:val="20"/>
+                <w:szCs w:val="20"/>
+              </w:rPr>
+            </w:pPr>
+            <w:r>
+              <w:rPr>
+                <w:rFonts w:ascii="Segoe UI" w:hAnsi="Segoe UI" w:cs="Segoe UI"/>
+                <w:color w:val="000000" w:themeColor="text1"/>
+                <w:sz w:val="20"/>
+                <w:szCs w:val="20"/>
+              </w:rPr>
+              <w:t>4/4</w:t>
+            </w:r>
+          </w:p>
+        </w:tc>
+      </w:tr>
+      <w:tr>
+        <w:tc>
+          <w:tcPr>
+            <w:tcW w:w="0" w:type="auto"/>
+            <w:shd w:val="clear" w:color="auto" w:fill="FFFFFF" w:themeFill="background1"/>
+            <w:tcMar>
+              <w:top w:w="30" w:type="dxa"/>
+              <w:left w:w="30" w:type="dxa"/>
+              <w:bottom w:w="30" w:type="dxa"/>
+              <w:right w:w="30" w:type="dxa"/>
+            </w:tcMar>
+            <w:vAlign w:val="center"/>
+            <w:hideMark/>
+          </w:tcPr>
+          <w:p>
+            <w:pPr>
+              <w:shd w:val="clear" w:color="auto" w:fill="FFFFFF" w:themeFill="background1"/>
+              <w:rPr>
+                <w:rFonts w:ascii="Segoe UI" w:hAnsi="Segoe UI" w:cs="Segoe UI"/>
+                <w:color w:val="000000" w:themeColor="text1"/>
+                <w:sz w:val="20"/>
+                <w:szCs w:val="20"/>
+              </w:rPr>
+            </w:pPr>
+          </w:p>
+        </w:tc>
+        <w:tc>
+          <w:tcPr>
+            <w:tcW w:w="0" w:type="auto"/>
+            <w:shd w:val="clear" w:color="auto" w:fill="FFFFFF" w:themeFill="background1"/>
+            <w:tcMar>
+              <w:top w:w="30" w:type="dxa"/>
+              <w:left w:w="30" w:type="dxa"/>
+              <w:bottom w:w="30" w:type="dxa"/>
+              <w:right w:w="30" w:type="dxa"/>
+            </w:tcMar>
+            <w:vAlign w:val="center"/>
+            <w:hideMark/>
+          </w:tcPr>
+          <w:p>
+            <w:pPr>
+              <w:shd w:val="clear" w:color="auto" w:fill="FFFFFF" w:themeFill="background1"/>
+              <w:rPr>
+                <w:rFonts w:ascii="Segoe UI" w:hAnsi="Segoe UI" w:cs="Segoe UI"/>
+                <w:color w:val="000000" w:themeColor="text1"/>
+                <w:sz w:val="20"/>
+                <w:szCs w:val="20"/>
+              </w:rPr>
+            </w:pPr>
+            <w:r>
+              <w:rPr>
+                <w:rFonts w:ascii="Segoe UI" w:hAnsi="Segoe UI" w:cs="Segoe UI"/>
+                <w:color w:val="000000" w:themeColor="text1"/>
+                <w:sz w:val="20"/>
+                <w:szCs w:val="20"/>
+              </w:rPr>
+              <w:t>Can't be answered from the data: says so instead of inventing</w:t>
+            </w:r>
+          </w:p>
+        </w:tc>
+        <w:tc>
+          <w:tcPr>
+            <w:tcW w:w="0" w:type="auto"/>
+            <w:shd w:val="clear" w:color="auto" w:fill="FFFFFF" w:themeFill="background1"/>
+            <w:tcMar>
+              <w:top w:w="30" w:type="dxa"/>
+              <w:left w:w="30" w:type="dxa"/>
+              <w:bottom w:w="30" w:type="dxa"/>
+              <w:right w:w="30" w:type="dxa"/>
+            </w:tcMar>
+            <w:vAlign w:val="center"/>
+            <w:hideMark/>
+          </w:tcPr>
+          <w:p>
+            <w:pPr>
+              <w:shd w:val="clear" w:color="auto" w:fill="FFFFFF" w:themeFill="background1"/>
+              <w:rPr>
+                <w:rFonts w:ascii="Segoe UI" w:hAnsi="Segoe UI" w:cs="Segoe UI"/>
+                <w:color w:val="000000" w:themeColor="text1"/>
+                <w:sz w:val="20"/>
+                <w:szCs w:val="20"/>
+              </w:rPr>
+            </w:pPr>
+            <w:r>
+              <w:rPr>
+                <w:rFonts w:ascii="Segoe UI" w:hAnsi="Segoe UI" w:cs="Segoe UI"/>
+                <w:color w:val="000000" w:themeColor="text1"/>
+                <w:sz w:val="20"/>
+                <w:szCs w:val="20"/>
+              </w:rPr>
+              <w:t>3/3</w:t>
+            </w:r>
+          </w:p>
+        </w:tc>
+      </w:tr>
+      <w:tr>
+        <w:tc>
+          <w:tcPr>
+            <w:tcW w:w="0" w:type="auto"/>
+            <w:shd w:val="clear" w:color="auto" w:fill="FFFFFF" w:themeFill="background1"/>
+            <w:tcMar>
+              <w:top w:w="30" w:type="dxa"/>
+              <w:left w:w="30" w:type="dxa"/>
+              <w:bottom w:w="30" w:type="dxa"/>
+              <w:right w:w="30" w:type="dxa"/>
+            </w:tcMar>
+            <w:vAlign w:val="center"/>
+            <w:hideMark/>
+          </w:tcPr>
+          <w:p>
+            <w:pPr>
+              <w:shd w:val="clear" w:color="auto" w:fill="FFFFFF" w:themeFill="background1"/>
+              <w:rPr>
+                <w:rFonts w:ascii="Segoe UI" w:hAnsi="Segoe UI" w:cs="Segoe UI"/>
+                <w:color w:val="000000" w:themeColor="text1"/>
+                <w:sz w:val="20"/>
+                <w:szCs w:val="20"/>
+              </w:rPr>
+            </w:pPr>
+          </w:p>
+        </w:tc>
+        <w:tc>
+          <w:tcPr>
+            <w:tcW w:w="0" w:type="auto"/>
+            <w:shd w:val="clear" w:color="auto" w:fill="FFFFFF" w:themeFill="background1"/>
+            <w:tcMar>
+              <w:top w:w="30" w:type="dxa"/>
+              <w:left w:w="30" w:type="dxa"/>
+              <w:bottom w:w="30" w:type="dxa"/>
+              <w:right w:w="30" w:type="dxa"/>
+            </w:tcMar>
+            <w:vAlign w:val="center"/>
+            <w:hideMark/>
+          </w:tcPr>
+          <w:p>
+            <w:pPr>
+              <w:shd w:val="clear" w:color="auto" w:fill="FFFFFF" w:themeFill="background1"/>
+              <w:rPr>
+                <w:rFonts w:ascii="Segoe UI" w:hAnsi="Segoe UI" w:cs="Segoe UI"/>
+                <w:color w:val="000000" w:themeColor="text1"/>
+                <w:sz w:val="20"/>
+                <w:szCs w:val="20"/>
+              </w:rPr>
+            </w:pPr>
+            <w:r>
+              <w:rPr>
+                <w:rFonts w:ascii="Segoe UI" w:hAnsi="Segoe UI" w:cs="Segoe UI"/>
+                <w:color w:val="000000" w:themeColor="text1"/>
+                <w:sz w:val="20"/>
+                <w:szCs w:val="20"/>
+              </w:rPr>
+              <w:t>Impossible deadline: says so, gives the earliest date and options</w:t>
+            </w:r>
+          </w:p>
+        </w:tc>
+        <w:tc>
+          <w:tcPr>
+            <w:tcW w:w="0" w:type="auto"/>
+            <w:shd w:val="clear" w:color="auto" w:fill="FFFFFF" w:themeFill="background1"/>
+            <w:tcMar>
+              <w:top w:w="30" w:type="dxa"/>
+              <w:left w:w="30" w:type="dxa"/>
+              <w:bottom w:w="30" w:type="dxa"/>
+              <w:right w:w="30" w:type="dxa"/>
+            </w:tcMar>
+            <w:vAlign w:val="center"/>
+            <w:hideMark/>
+          </w:tcPr>
+          <w:p>
+            <w:pPr>
+              <w:shd w:val="clear" w:color="auto" w:fill="FFFFFF" w:themeFill="background1"/>
+              <w:rPr>
+                <w:rFonts w:ascii="Segoe UI" w:hAnsi="Segoe UI" w:cs="Segoe UI"/>
+                <w:color w:val="000000" w:themeColor="text1"/>
+                <w:sz w:val="20"/>
+                <w:szCs w:val="20"/>
+              </w:rPr>
+            </w:pPr>
+            <w:r>
+              <w:rPr>
+                <w:rFonts w:ascii="Segoe UI" w:hAnsi="Segoe UI" w:cs="Segoe UI"/>
+                <w:color w:val="000000" w:themeColor="text1"/>
+                <w:sz w:val="20"/>
+                <w:szCs w:val="20"/>
+              </w:rPr>
+              <w:t>3/3</w:t>
+            </w:r>
+          </w:p>
+        </w:tc>
+      </w:tr>
+      <w:tr>
+        <w:tc>
+          <w:tcPr>
+            <w:tcW w:w="0" w:type="auto"/>
+            <w:shd w:val="clear" w:color="auto" w:fill="FFFFFF" w:themeFill="background1"/>
+            <w:tcMar>
+              <w:top w:w="30" w:type="dxa"/>
+              <w:left w:w="30" w:type="dxa"/>
+              <w:bottom w:w="30" w:type="dxa"/>
+              <w:right w:w="30" w:type="dxa"/>
+            </w:tcMar>
+            <w:vAlign w:val="center"/>
+            <w:hideMark/>
+          </w:tcPr>
+          <w:p>
+            <w:pPr>
+              <w:shd w:val="clear" w:color="auto" w:fill="FFFFFF" w:themeFill="background1"/>
+              <w:rPr>
+                <w:rFonts w:ascii="Segoe UI" w:hAnsi="Segoe UI" w:cs="Segoe UI"/>
+                <w:color w:val="000000" w:themeColor="text1"/>
+                <w:sz w:val="20"/>
+                <w:szCs w:val="20"/>
+              </w:rPr>
+            </w:pPr>
+          </w:p>
+        </w:tc>
+        <w:tc>
+          <w:tcPr>
+            <w:tcW w:w="0" w:type="auto"/>
+            <w:shd w:val="clear" w:color="auto" w:fill="FFFFFF" w:themeFill="background1"/>
+            <w:tcMar>
+              <w:top w:w="30" w:type="dxa"/>
+              <w:left w:w="30" w:type="dxa"/>
+              <w:bottom w:w="30" w:type="dxa"/>
+              <w:right w:w="30" w:type="dxa"/>
+            </w:tcMar>
+            <w:vAlign w:val="center"/>
+            <w:hideMark/>
+          </w:tcPr>
+          <w:p>
+            <w:pPr>
+              <w:shd w:val="clear" w:color="auto" w:fill="FFFFFF" w:themeFill="background1"/>
+              <w:rPr>
+                <w:rFonts w:ascii="Segoe UI" w:hAnsi="Segoe UI" w:cs="Segoe UI"/>
+                <w:color w:val="000000" w:themeColor="text1"/>
+                <w:sz w:val="20"/>
+                <w:szCs w:val="20"/>
+              </w:rPr>
+            </w:pPr>
+            <w:r>
+              <w:rPr>
+                <w:rFonts w:ascii="Segoe UI" w:hAnsi="Segoe UI" w:cs="Segoe UI"/>
+                <w:color w:val="000000" w:themeColor="text1"/>
+                <w:sz w:val="20"/>
+                <w:szCs w:val="20"/>
+              </w:rPr>
+              <w:t xml:space="preserve">Instructions followed (e.g. "keep it away from </w:t>
+            </w:r>
+            <w:proofErr w:type="spellStart"/>
+            <w:r>
+              <w:rPr>
+                <w:rFonts w:ascii="Segoe UI" w:hAnsi="Segoe UI" w:cs="Segoe UI"/>
+                <w:color w:val="000000" w:themeColor="text1"/>
+                <w:sz w:val="20"/>
+                <w:szCs w:val="20"/>
+              </w:rPr>
+              <w:t>BudgetWorks</w:t>
+            </w:r>
+            <w:proofErr w:type="spellEnd"/>
+            <w:r>
+              <w:rPr>
+                <w:rFonts w:ascii="Segoe UI" w:hAnsi="Segoe UI" w:cs="Segoe UI"/>
+                <w:color w:val="000000" w:themeColor="text1"/>
+                <w:sz w:val="20"/>
+                <w:szCs w:val="20"/>
+              </w:rPr>
+              <w:t>") and recorded with who gave them</w:t>
+            </w:r>
+          </w:p>
+        </w:tc>
+        <w:tc>
+          <w:tcPr>
+            <w:tcW w:w="0" w:type="auto"/>
+            <w:shd w:val="clear" w:color="auto" w:fill="FFFFFF" w:themeFill="background1"/>
+            <w:tcMar>
+              <w:top w:w="30" w:type="dxa"/>
+              <w:left w:w="30" w:type="dxa"/>
+              <w:bottom w:w="30" w:type="dxa"/>
+              <w:right w:w="30" w:type="dxa"/>
+            </w:tcMar>
+            <w:vAlign w:val="center"/>
+            <w:hideMark/>
+          </w:tcPr>
+          <w:p>
+            <w:pPr>
+              <w:shd w:val="clear" w:color="auto" w:fill="FFFFFF" w:themeFill="background1"/>
+              <w:rPr>
+                <w:rFonts w:ascii="Segoe UI" w:hAnsi="Segoe UI" w:cs="Segoe UI"/>
+                <w:color w:val="000000" w:themeColor="text1"/>
+                <w:sz w:val="20"/>
+                <w:szCs w:val="20"/>
+              </w:rPr>
+            </w:pPr>
+            <w:r>
+              <w:rPr>
+                <w:rFonts w:ascii="Segoe UI" w:hAnsi="Segoe UI" w:cs="Segoe UI"/>
+                <w:color w:val="000000" w:themeColor="text1"/>
+                <w:sz w:val="20"/>
+                <w:szCs w:val="20"/>
+              </w:rPr>
+              <w:t>6/6</w:t>
+            </w:r>
+          </w:p>
+        </w:tc>
+      </w:tr>
+      <w:tr>
+        <w:tc>
+          <w:tcPr>
+            <w:tcW w:w="0" w:type="auto"/>
+            <w:shd w:val="clear" w:color="auto" w:fill="FFFFFF" w:themeFill="background1"/>
+            <w:tcMar>
+              <w:top w:w="30" w:type="dxa"/>
+              <w:left w:w="30" w:type="dxa"/>
+              <w:bottom w:w="30" w:type="dxa"/>
+              <w:right w:w="30" w:type="dxa"/>
+            </w:tcMar>
+            <w:vAlign w:val="center"/>
+            <w:hideMark/>
+          </w:tcPr>
+          <w:p>
+            <w:pPr>
+              <w:shd w:val="clear" w:color="auto" w:fill="FFFFFF" w:themeFill="background1"/>
+              <w:rPr>
+                <w:rFonts w:ascii="Segoe UI" w:hAnsi="Segoe UI" w:cs="Segoe UI"/>
+                <w:color w:val="000000" w:themeColor="text1"/>
+                <w:sz w:val="20"/>
+                <w:szCs w:val="20"/>
+              </w:rPr>
+            </w:pPr>
+          </w:p>
+        </w:tc>
+        <w:tc>
+          <w:tcPr>
+            <w:tcW w:w="0" w:type="auto"/>
+            <w:shd w:val="clear" w:color="auto" w:fill="FFFFFF" w:themeFill="background1"/>
+            <w:tcMar>
+              <w:top w:w="30" w:type="dxa"/>
+              <w:left w:w="30" w:type="dxa"/>
+              <w:bottom w:w="30" w:type="dxa"/>
+              <w:right w:w="30" w:type="dxa"/>
+            </w:tcMar>
+            <w:vAlign w:val="center"/>
+            <w:hideMark/>
+          </w:tcPr>
+          <w:p>
+            <w:pPr>
+              <w:shd w:val="clear" w:color="auto" w:fill="FFFFFF" w:themeFill="background1"/>
+              <w:rPr>
+                <w:rFonts w:ascii="Segoe UI" w:hAnsi="Segoe UI" w:cs="Segoe UI"/>
+                <w:color w:val="000000" w:themeColor="text1"/>
+                <w:sz w:val="20"/>
+                <w:szCs w:val="20"/>
+              </w:rPr>
+            </w:pPr>
+            <w:r>
+              <w:rPr>
+                <w:rFonts w:ascii="Segoe UI" w:hAnsi="Segoe UI" w:cs="Segoe UI"/>
+                <w:color w:val="000000" w:themeColor="text1"/>
+                <w:sz w:val="20"/>
+                <w:szCs w:val="20"/>
+              </w:rPr>
+              <w:t>Explanations containing a number that didn't come from a tool</w:t>
+            </w:r>
+          </w:p>
+        </w:tc>
+        <w:tc>
+          <w:tcPr>
+            <w:tcW w:w="0" w:type="auto"/>
+            <w:shd w:val="clear" w:color="auto" w:fill="FFFFFF" w:themeFill="background1"/>
+            <w:tcMar>
+              <w:top w:w="30" w:type="dxa"/>
+              <w:left w:w="30" w:type="dxa"/>
+              <w:bottom w:w="30" w:type="dxa"/>
+              <w:right w:w="30" w:type="dxa"/>
+            </w:tcMar>
+            <w:vAlign w:val="center"/>
+            <w:hideMark/>
+          </w:tcPr>
+          <w:p>
+            <w:pPr>
+              <w:shd w:val="clear" w:color="auto" w:fill="FFFFFF" w:themeFill="background1"/>
+              <w:rPr>
+                <w:rFonts w:ascii="Segoe UI" w:hAnsi="Segoe UI" w:cs="Segoe UI"/>
+                <w:color w:val="000000" w:themeColor="text1"/>
+                <w:sz w:val="20"/>
+                <w:szCs w:val="20"/>
+              </w:rPr>
+            </w:pPr>
+            <w:r>
+              <w:rPr>
+                <w:rFonts w:ascii="Segoe UI" w:hAnsi="Segoe UI" w:cs="Segoe UI"/>
+                <w:b/>
+                <w:bCs/>
+                <w:color w:val="000000" w:themeColor="text1"/>
+                <w:sz w:val="20"/>
+                <w:szCs w:val="20"/>
+              </w:rPr>
+              <w:t>0</w:t>
+            </w:r>
+          </w:p>
+        </w:tc>
+      </w:tr>
+      <w:tr>
+        <w:tc>
+          <w:tcPr>
+            <w:tcW w:w="0" w:type="auto"/>
+            <w:shd w:val="clear" w:color="auto" w:fill="FFFFFF" w:themeFill="background1"/>
+            <w:tcMar>
+              <w:top w:w="30" w:type="dxa"/>
+              <w:left w:w="30" w:type="dxa"/>
+              <w:bottom w:w="30" w:type="dxa"/>
+              <w:right w:w="30" w:type="dxa"/>
+            </w:tcMar>
+            <w:vAlign w:val="center"/>
+            <w:hideMark/>
+          </w:tcPr>
+          <w:p>
+            <w:pPr>
+              <w:shd w:val="clear" w:color="auto" w:fill="FFFFFF" w:themeFill="background1"/>
+              <w:rPr>
+                <w:rFonts w:ascii="Segoe UI" w:hAnsi="Segoe UI" w:cs="Segoe UI"/>
+                <w:color w:val="000000" w:themeColor="text1"/>
+                <w:sz w:val="20"/>
+                <w:szCs w:val="20"/>
+              </w:rPr>
+            </w:pPr>
+            <w:r>
+              <w:rPr>
+                <w:rFonts w:ascii="Segoe UI" w:hAnsi="Segoe UI" w:cs="Segoe UI"/>
+                <w:b/>
+                <w:bCs/>
+                <w:color w:val="000000" w:themeColor="text1"/>
+                <w:sz w:val="20"/>
+                <w:szCs w:val="20"/>
+              </w:rPr>
+              <w:t>Held-out test set</w:t>
+            </w:r>
+          </w:p>
+        </w:tc>
+        <w:tc>
+          <w:tcPr>
+            <w:tcW w:w="0" w:type="auto"/>
+            <w:shd w:val="clear" w:color="auto" w:fill="FFFFFF" w:themeFill="background1"/>
+            <w:tcMar>
+              <w:top w:w="30" w:type="dxa"/>
+              <w:left w:w="30" w:type="dxa"/>
+              <w:bottom w:w="30" w:type="dxa"/>
+              <w:right w:w="30" w:type="dxa"/>
+            </w:tcMar>
+            <w:vAlign w:val="center"/>
+            <w:hideMark/>
+          </w:tcPr>
+          <w:p>
+            <w:pPr>
+              <w:shd w:val="clear" w:color="auto" w:fill="FFFFFF" w:themeFill="background1"/>
+              <w:rPr>
+                <w:rFonts w:ascii="Segoe UI" w:hAnsi="Segoe UI" w:cs="Segoe UI"/>
+                <w:color w:val="000000" w:themeColor="text1"/>
+                <w:sz w:val="20"/>
+                <w:szCs w:val="20"/>
+              </w:rPr>
+            </w:pPr>
+            <w:r>
+              <w:rPr>
+                <w:rFonts w:ascii="Segoe UI" w:hAnsi="Segoe UI" w:cs="Segoe UI"/>
+                <w:color w:val="000000" w:themeColor="text1"/>
+                <w:sz w:val="20"/>
+                <w:szCs w:val="20"/>
+              </w:rPr>
+              <w:t>10+ new requests run and reported </w:t>
+            </w:r>
+            <w:r>
+              <w:rPr>
+                <w:rFonts w:ascii="Segoe UI" w:hAnsi="Segoe UI" w:cs="Segoe UI"/>
+                <w:b/>
+                <w:bCs/>
+                <w:color w:val="000000" w:themeColor="text1"/>
+                <w:sz w:val="20"/>
+                <w:szCs w:val="20"/>
+              </w:rPr>
+              <w:t>separately</w:t>
+            </w:r>
+            <w:r>
+              <w:rPr>
+                <w:rFonts w:ascii="Segoe UI" w:hAnsi="Segoe UI" w:cs="Segoe UI"/>
+                <w:color w:val="000000" w:themeColor="text1"/>
+                <w:sz w:val="20"/>
+                <w:szCs w:val="20"/>
+              </w:rPr>
+              <w:t> from the 30</w:t>
+            </w:r>
+          </w:p>
+        </w:tc>
+        <w:tc>
+          <w:tcPr>
+            <w:tcW w:w="0" w:type="auto"/>
+            <w:shd w:val="clear" w:color="auto" w:fill="FFFFFF" w:themeFill="background1"/>
+            <w:tcMar>
+              <w:top w:w="30" w:type="dxa"/>
+              <w:left w:w="30" w:type="dxa"/>
+              <w:bottom w:w="30" w:type="dxa"/>
+              <w:right w:w="30" w:type="dxa"/>
+            </w:tcMar>
+            <w:vAlign w:val="center"/>
+            <w:hideMark/>
+          </w:tcPr>
+          <w:p>
+            <w:pPr>
+              <w:shd w:val="clear" w:color="auto" w:fill="FFFFFF" w:themeFill="background1"/>
+              <w:rPr>
+                <w:rFonts w:ascii="Segoe UI" w:hAnsi="Segoe UI" w:cs="Segoe UI"/>
+                <w:color w:val="000000" w:themeColor="text1"/>
+                <w:sz w:val="20"/>
+                <w:szCs w:val="20"/>
+              </w:rPr>
+            </w:pPr>
+            <w:r>
+              <w:rPr>
+                <w:rFonts w:ascii="Segoe UI" w:hAnsi="Segoe UI" w:cs="Segoe UI"/>
+                <w:color w:val="000000" w:themeColor="text1"/>
+                <w:sz w:val="20"/>
+                <w:szCs w:val="20"/>
+              </w:rPr>
+              <w:t>Reported, whatever the score</w:t>
+            </w:r>
+          </w:p>
+        </w:tc>
+      </w:tr>
+    </w:tbl>
+    <w:p/>
+    <w:p>
+      <w:pPr>
+        <w:pStyle w:val="Heading3"/>
+        <w:rPr>
+          <w:rFonts w:ascii="Segoe UI" w:eastAsia="Times New Roman" w:hAnsi="Segoe UI" w:cs="Segoe UI"/>
+          <w:color w:val="000000" w:themeColor="text1"/>
+          <w:sz w:val="20"/>
+          <w:szCs w:val="20"/>
+        </w:rPr>
+      </w:pPr>
+      <w:r>
+        <w:rPr>
+          <w:rFonts w:ascii="Segoe UI" w:eastAsia="Times New Roman" w:hAnsi="Segoe UI" w:cs="Segoe UI"/>
+          <w:color w:val="000000" w:themeColor="text1"/>
+          <w:sz w:val="20"/>
+          <w:szCs w:val="20"/>
+        </w:rPr>
+        <w:t>Making the app usable</w:t>
+      </w:r>
+    </w:p>
+    <w:tbl>
+      <w:tblPr>
+        <w:tblW w:w="0" w:type="auto"/>
+        <w:shd w:val="clear" w:color="auto" w:fill="181818"/>
+        <w:tblCellMar>
+          <w:top w:w="15" w:type="dxa"/>
+          <w:left w:w="15" w:type="dxa"/>
+          <w:bottom w:w="15" w:type="dxa"/>
+          <w:right w:w="15" w:type="dxa"/>
+        </w:tblCellMar>
+        <w:tblLook w:val="04A0" w:firstRow="1" w:lastRow="0" w:firstColumn="1" w:lastColumn="0" w:noHBand="0" w:noVBand="1"/>
+      </w:tblPr>
+      <w:tblGrid>
+        <w:gridCol w:w="1622"/>
+        <w:gridCol w:w="5170"/>
+        <w:gridCol w:w="2234"/>
+      </w:tblGrid>
+      <w:tr>
+        <w:trPr>
+          <w:tblHeader/>
+        </w:trPr>
+        <w:tc>
+          <w:tcPr>
+            <w:tcW w:w="0" w:type="auto"/>
+            <w:tcMar>
+              <w:top w:w="30" w:type="dxa"/>
+              <w:left w:w="30" w:type="dxa"/>
+              <w:bottom w:w="30" w:type="dxa"/>
+              <w:right w:w="30" w:type="dxa"/>
+            </w:tcMar>
+            <w:vAlign w:val="center"/>
+            <w:hideMark/>
+          </w:tcPr>
+          <w:p>
+            <w:pPr>
+              <w:jc w:val="center"/>
+              <w:rPr>
+                <w:rFonts w:ascii="Segoe UI" w:hAnsi="Segoe UI" w:cs="Segoe UI"/>
+                <w:color w:val="000000" w:themeColor="text1"/>
+                <w:sz w:val="20"/>
+                <w:szCs w:val="20"/>
+              </w:rPr>
+            </w:pPr>
+            <w:r>
+              <w:rPr>
+                <w:rFonts w:ascii="Segoe UI" w:hAnsi="Segoe UI" w:cs="Segoe UI"/>
+                <w:color w:val="000000" w:themeColor="text1"/>
+                <w:sz w:val="20"/>
+                <w:szCs w:val="20"/>
+              </w:rPr>
+              <w:t>Roadmap item</w:t>
+            </w:r>
+          </w:p>
+        </w:tc>
+        <w:tc>
+          <w:tcPr>
+            <w:tcW w:w="0" w:type="auto"/>
+            <w:tcMar>
+              <w:top w:w="30" w:type="dxa"/>
+              <w:left w:w="30" w:type="dxa"/>
+              <w:bottom w:w="30" w:type="dxa"/>
+              <w:right w:w="30" w:type="dxa"/>
+            </w:tcMar>
+            <w:vAlign w:val="center"/>
+            <w:hideMark/>
+          </w:tcPr>
+          <w:p>
+            <w:pPr>
+              <w:jc w:val="center"/>
+              <w:rPr>
+                <w:rFonts w:ascii="Segoe UI" w:hAnsi="Segoe UI" w:cs="Segoe UI"/>
+                <w:color w:val="000000" w:themeColor="text1"/>
+                <w:sz w:val="20"/>
+                <w:szCs w:val="20"/>
+              </w:rPr>
+            </w:pPr>
+            <w:r>
+              <w:rPr>
+                <w:rFonts w:ascii="Segoe UI" w:hAnsi="Segoe UI" w:cs="Segoe UI"/>
+                <w:color w:val="000000" w:themeColor="text1"/>
+                <w:sz w:val="20"/>
+                <w:szCs w:val="20"/>
+              </w:rPr>
+              <w:t>Success looks like</w:t>
+            </w:r>
+          </w:p>
+        </w:tc>
+        <w:tc>
+          <w:tcPr>
+            <w:tcW w:w="0" w:type="auto"/>
+            <w:tcMar>
+              <w:top w:w="30" w:type="dxa"/>
+              <w:left w:w="30" w:type="dxa"/>
+              <w:bottom w:w="30" w:type="dxa"/>
+              <w:right w:w="30" w:type="dxa"/>
+            </w:tcMar>
+            <w:vAlign w:val="center"/>
+            <w:hideMark/>
+          </w:tcPr>
+          <w:p>
+            <w:pPr>
+              <w:jc w:val="center"/>
+              <w:rPr>
+                <w:rFonts w:ascii="Segoe UI" w:hAnsi="Segoe UI" w:cs="Segoe UI"/>
+                <w:color w:val="000000" w:themeColor="text1"/>
+                <w:sz w:val="20"/>
+                <w:szCs w:val="20"/>
+              </w:rPr>
+            </w:pPr>
+            <w:r>
+              <w:rPr>
+                <w:rFonts w:ascii="Segoe UI" w:hAnsi="Segoe UI" w:cs="Segoe UI"/>
+                <w:color w:val="000000" w:themeColor="text1"/>
+                <w:sz w:val="20"/>
+                <w:szCs w:val="20"/>
+              </w:rPr>
+              <w:t>Target</w:t>
+            </w:r>
+          </w:p>
+        </w:tc>
+      </w:tr>
+      <w:tr>
+        <w:tc>
+          <w:tcPr>
+            <w:tcW w:w="0" w:type="auto"/>
+            <w:tcMar>
+              <w:top w:w="30" w:type="dxa"/>
+              <w:left w:w="30" w:type="dxa"/>
+              <w:bottom w:w="30" w:type="dxa"/>
+              <w:right w:w="30" w:type="dxa"/>
+            </w:tcMar>
+            <w:vAlign w:val="center"/>
+            <w:hideMark/>
+          </w:tcPr>
+          <w:p>
+            <w:pPr>
+              <w:rPr>
+                <w:rFonts w:ascii="Segoe UI" w:hAnsi="Segoe UI" w:cs="Segoe UI"/>
+                <w:color w:val="000000" w:themeColor="text1"/>
+                <w:sz w:val="20"/>
+                <w:szCs w:val="20"/>
+              </w:rPr>
+            </w:pPr>
+            <w:r>
+              <w:rPr>
+                <w:rStyle w:val="Strong"/>
+                <w:rFonts w:ascii="Segoe UI" w:hAnsi="Segoe UI" w:cs="Segoe UI"/>
+                <w:color w:val="000000" w:themeColor="text1"/>
+                <w:sz w:val="20"/>
+                <w:szCs w:val="20"/>
+              </w:rPr>
+              <w:t>Demo online</w:t>
+            </w:r>
+          </w:p>
+        </w:tc>
+        <w:tc>
+          <w:tcPr>
+            <w:tcW w:w="0" w:type="auto"/>
+            <w:tcMar>
+              <w:top w:w="30" w:type="dxa"/>
+              <w:left w:w="30" w:type="dxa"/>
+              <w:bottom w:w="30" w:type="dxa"/>
+              <w:right w:w="30" w:type="dxa"/>
+            </w:tcMar>
+            <w:vAlign w:val="center"/>
+            <w:hideMark/>
+          </w:tcPr>
+          <w:p>
+            <w:pPr>
+              <w:rPr>
+                <w:rFonts w:ascii="Segoe UI" w:hAnsi="Segoe UI" w:cs="Segoe UI"/>
+                <w:color w:val="000000" w:themeColor="text1"/>
+                <w:sz w:val="20"/>
+                <w:szCs w:val="20"/>
+              </w:rPr>
+            </w:pPr>
+            <w:r>
+              <w:rPr>
+                <w:rFonts w:ascii="Segoe UI" w:hAnsi="Segoe UI" w:cs="Segoe UI"/>
+                <w:color w:val="000000" w:themeColor="text1"/>
+                <w:sz w:val="20"/>
+                <w:szCs w:val="20"/>
+              </w:rPr>
+              <w:t>GitHub and demo links open from any computer</w:t>
+            </w:r>
+          </w:p>
+        </w:tc>
+        <w:tc>
+          <w:tcPr>
+            <w:tcW w:w="0" w:type="auto"/>
+            <w:tcMar>
+              <w:top w:w="30" w:type="dxa"/>
+              <w:left w:w="30" w:type="dxa"/>
+              <w:bottom w:w="30" w:type="dxa"/>
+              <w:right w:w="30" w:type="dxa"/>
+            </w:tcMar>
+            <w:vAlign w:val="center"/>
+            <w:hideMark/>
+          </w:tcPr>
+          <w:p>
+            <w:pPr>
+              <w:rPr>
+                <w:rFonts w:ascii="Segoe UI" w:hAnsi="Segoe UI" w:cs="Segoe UI"/>
+                <w:color w:val="000000" w:themeColor="text1"/>
+                <w:sz w:val="20"/>
+                <w:szCs w:val="20"/>
+              </w:rPr>
+            </w:pPr>
+            <w:r>
+              <w:rPr>
+                <w:rFonts w:ascii="Segoe UI" w:hAnsi="Segoe UI" w:cs="Segoe UI"/>
+                <w:color w:val="000000" w:themeColor="text1"/>
+                <w:sz w:val="20"/>
+                <w:szCs w:val="20"/>
+              </w:rPr>
+              <w:t>Both working</w:t>
+            </w:r>
+          </w:p>
+        </w:tc>
+      </w:tr>
+      <w:tr>
+        <w:tc>
+          <w:tcPr>
+            <w:tcW w:w="0" w:type="auto"/>
+            <w:tcMar>
+              <w:top w:w="30" w:type="dxa"/>
+              <w:left w:w="30" w:type="dxa"/>
+              <w:bottom w:w="30" w:type="dxa"/>
+              <w:right w:w="30" w:type="dxa"/>
+            </w:tcMar>
+            <w:vAlign w:val="center"/>
+            <w:hideMark/>
+          </w:tcPr>
+          <w:p>
+            <w:pPr>
+              <w:rPr>
+                <w:rFonts w:ascii="Segoe UI" w:hAnsi="Segoe UI" w:cs="Segoe UI"/>
+                <w:color w:val="000000" w:themeColor="text1"/>
+                <w:sz w:val="20"/>
+                <w:szCs w:val="20"/>
+              </w:rPr>
+            </w:pPr>
+            <w:r>
+              <w:rPr>
+                <w:rStyle w:val="Strong"/>
+                <w:rFonts w:ascii="Segoe UI" w:hAnsi="Segoe UI" w:cs="Segoe UI"/>
+                <w:color w:val="000000" w:themeColor="text1"/>
+                <w:sz w:val="20"/>
+                <w:szCs w:val="20"/>
+              </w:rPr>
+              <w:t>Dispatcher UI polish</w:t>
+            </w:r>
+          </w:p>
+        </w:tc>
+        <w:tc>
+          <w:tcPr>
+            <w:tcW w:w="0" w:type="auto"/>
+            <w:tcMar>
+              <w:top w:w="30" w:type="dxa"/>
+              <w:left w:w="30" w:type="dxa"/>
+              <w:bottom w:w="30" w:type="dxa"/>
+              <w:right w:w="30" w:type="dxa"/>
+            </w:tcMar>
+            <w:vAlign w:val="center"/>
+            <w:hideMark/>
+          </w:tcPr>
+          <w:p>
+            <w:pPr>
+              <w:rPr>
+                <w:rFonts w:ascii="Segoe UI" w:hAnsi="Segoe UI" w:cs="Segoe UI"/>
+                <w:color w:val="000000" w:themeColor="text1"/>
+                <w:sz w:val="20"/>
+                <w:szCs w:val="20"/>
+              </w:rPr>
+            </w:pPr>
+            <w:r>
+              <w:rPr>
+                <w:rFonts w:ascii="Segoe UI" w:hAnsi="Segoe UI" w:cs="Segoe UI"/>
+                <w:color w:val="000000" w:themeColor="text1"/>
+                <w:sz w:val="20"/>
+                <w:szCs w:val="20"/>
+              </w:rPr>
+              <w:t>Recommendation, ETA and cost visible without scrolling or clicking</w:t>
+            </w:r>
+          </w:p>
+        </w:tc>
+        <w:tc>
+          <w:tcPr>
+            <w:tcW w:w="0" w:type="auto"/>
+            <w:tcMar>
+              <w:top w:w="30" w:type="dxa"/>
+              <w:left w:w="30" w:type="dxa"/>
+              <w:bottom w:w="30" w:type="dxa"/>
+              <w:right w:w="30" w:type="dxa"/>
+            </w:tcMar>
+            <w:vAlign w:val="center"/>
+            <w:hideMark/>
+          </w:tcPr>
+          <w:p>
+            <w:pPr>
+              <w:rPr>
+                <w:rFonts w:ascii="Segoe UI" w:hAnsi="Segoe UI" w:cs="Segoe UI"/>
+                <w:color w:val="000000" w:themeColor="text1"/>
+                <w:sz w:val="20"/>
+                <w:szCs w:val="20"/>
+              </w:rPr>
+            </w:pPr>
+            <w:r>
+              <w:rPr>
+                <w:rFonts w:ascii="Segoe UI" w:hAnsi="Segoe UI" w:cs="Segoe UI"/>
+                <w:color w:val="000000" w:themeColor="text1"/>
+                <w:sz w:val="20"/>
+                <w:szCs w:val="20"/>
+              </w:rPr>
+              <w:t>Yes</w:t>
+            </w:r>
+          </w:p>
+        </w:tc>
+      </w:tr>
+      <w:tr>
+        <w:tc>
+          <w:tcPr>
+            <w:tcW w:w="0" w:type="auto"/>
+            <w:tcMar>
+              <w:top w:w="30" w:type="dxa"/>
+              <w:left w:w="30" w:type="dxa"/>
+              <w:bottom w:w="30" w:type="dxa"/>
+              <w:right w:w="30" w:type="dxa"/>
+            </w:tcMar>
+            <w:vAlign w:val="center"/>
+            <w:hideMark/>
+          </w:tcPr>
+          <w:p>
+            <w:pPr>
+              <w:rPr>
+                <w:rFonts w:ascii="Segoe UI" w:hAnsi="Segoe UI" w:cs="Segoe UI"/>
+                <w:color w:val="000000" w:themeColor="text1"/>
+                <w:sz w:val="20"/>
+                <w:szCs w:val="20"/>
+              </w:rPr>
+            </w:pPr>
+            <w:r>
+              <w:rPr>
+                <w:rStyle w:val="Strong"/>
+                <w:rFonts w:ascii="Segoe UI" w:hAnsi="Segoe UI" w:cs="Segoe UI"/>
+                <w:color w:val="000000" w:themeColor="text1"/>
+                <w:sz w:val="20"/>
+                <w:szCs w:val="20"/>
+              </w:rPr>
+              <w:lastRenderedPageBreak/>
+              <w:t>Remember the follow-up</w:t>
+            </w:r>
+          </w:p>
+        </w:tc>
+        <w:tc>
+          <w:tcPr>
+            <w:tcW w:w="0" w:type="auto"/>
+            <w:tcMar>
+              <w:top w:w="30" w:type="dxa"/>
+              <w:left w:w="30" w:type="dxa"/>
+              <w:bottom w:w="30" w:type="dxa"/>
+              <w:right w:w="30" w:type="dxa"/>
+            </w:tcMar>
+            <w:vAlign w:val="center"/>
+            <w:hideMark/>
+          </w:tcPr>
+          <w:p>
+            <w:pPr>
+              <w:rPr>
+                <w:rFonts w:ascii="Segoe UI" w:hAnsi="Segoe UI" w:cs="Segoe UI"/>
+                <w:color w:val="000000" w:themeColor="text1"/>
+                <w:sz w:val="20"/>
+                <w:szCs w:val="20"/>
+              </w:rPr>
+            </w:pPr>
+            <w:r>
+              <w:rPr>
+                <w:rFonts w:ascii="Segoe UI" w:hAnsi="Segoe UI" w:cs="Segoe UI"/>
+                <w:color w:val="000000" w:themeColor="text1"/>
+                <w:sz w:val="20"/>
+                <w:szCs w:val="20"/>
+              </w:rPr>
+              <w:t>After a follow-up question, the user can reply with just the missing detail (e.g. "ORD-020") and get a recommendation</w:t>
+            </w:r>
+          </w:p>
+        </w:tc>
+        <w:tc>
+          <w:tcPr>
+            <w:tcW w:w="0" w:type="auto"/>
+            <w:tcMar>
+              <w:top w:w="30" w:type="dxa"/>
+              <w:left w:w="30" w:type="dxa"/>
+              <w:bottom w:w="30" w:type="dxa"/>
+              <w:right w:w="30" w:type="dxa"/>
+            </w:tcMar>
+            <w:vAlign w:val="center"/>
+            <w:hideMark/>
+          </w:tcPr>
+          <w:p>
+            <w:pPr>
+              <w:rPr>
+                <w:rFonts w:ascii="Segoe UI" w:hAnsi="Segoe UI" w:cs="Segoe UI"/>
+                <w:color w:val="000000" w:themeColor="text1"/>
+                <w:sz w:val="20"/>
+                <w:szCs w:val="20"/>
+              </w:rPr>
+            </w:pPr>
+            <w:r>
+              <w:rPr>
+                <w:rFonts w:ascii="Segoe UI" w:hAnsi="Segoe UI" w:cs="Segoe UI"/>
+                <w:color w:val="000000" w:themeColor="text1"/>
+                <w:sz w:val="20"/>
+                <w:szCs w:val="20"/>
+              </w:rPr>
+              <w:t>Works for the unclear and missing-info requests</w:t>
+            </w:r>
+          </w:p>
+        </w:tc>
+      </w:tr>
+      <w:tr>
+        <w:tc>
+          <w:tcPr>
+            <w:tcW w:w="0" w:type="auto"/>
+            <w:tcMar>
+              <w:top w:w="30" w:type="dxa"/>
+              <w:left w:w="30" w:type="dxa"/>
+              <w:bottom w:w="30" w:type="dxa"/>
+              <w:right w:w="30" w:type="dxa"/>
+            </w:tcMar>
+            <w:vAlign w:val="center"/>
+            <w:hideMark/>
+          </w:tcPr>
+          <w:p>
+            <w:pPr>
+              <w:rPr>
+                <w:rFonts w:ascii="Segoe UI" w:hAnsi="Segoe UI" w:cs="Segoe UI"/>
+                <w:color w:val="000000" w:themeColor="text1"/>
+                <w:sz w:val="20"/>
+                <w:szCs w:val="20"/>
+              </w:rPr>
+            </w:pPr>
+            <w:r>
+              <w:rPr>
+                <w:rStyle w:val="Strong"/>
+                <w:rFonts w:ascii="Segoe UI" w:hAnsi="Segoe UI" w:cs="Segoe UI"/>
+                <w:color w:val="000000" w:themeColor="text1"/>
+                <w:sz w:val="20"/>
+                <w:szCs w:val="20"/>
+              </w:rPr>
+              <w:t>Dispatcher override</w:t>
+            </w:r>
+          </w:p>
+        </w:tc>
+        <w:tc>
+          <w:tcPr>
+            <w:tcW w:w="0" w:type="auto"/>
+            <w:tcMar>
+              <w:top w:w="30" w:type="dxa"/>
+              <w:left w:w="30" w:type="dxa"/>
+              <w:bottom w:w="30" w:type="dxa"/>
+              <w:right w:w="30" w:type="dxa"/>
+            </w:tcMar>
+            <w:vAlign w:val="center"/>
+            <w:hideMark/>
+          </w:tcPr>
+          <w:p>
+            <w:pPr>
+              <w:rPr>
+                <w:rFonts w:ascii="Segoe UI" w:hAnsi="Segoe UI" w:cs="Segoe UI"/>
+                <w:color w:val="000000" w:themeColor="text1"/>
+                <w:sz w:val="20"/>
+                <w:szCs w:val="20"/>
+              </w:rPr>
+            </w:pPr>
+            <w:r>
+              <w:rPr>
+                <w:rFonts w:ascii="Segoe UI" w:hAnsi="Segoe UI" w:cs="Segoe UI"/>
+                <w:color w:val="000000" w:themeColor="text1"/>
+                <w:sz w:val="20"/>
+                <w:szCs w:val="20"/>
+              </w:rPr>
+              <w:t>Dispatcher can pick a different workshop; the reason is saved in the log</w:t>
+            </w:r>
+          </w:p>
+        </w:tc>
+        <w:tc>
+          <w:tcPr>
+            <w:tcW w:w="0" w:type="auto"/>
+            <w:tcMar>
+              <w:top w:w="30" w:type="dxa"/>
+              <w:left w:w="30" w:type="dxa"/>
+              <w:bottom w:w="30" w:type="dxa"/>
+              <w:right w:w="30" w:type="dxa"/>
+            </w:tcMar>
+            <w:vAlign w:val="center"/>
+            <w:hideMark/>
+          </w:tcPr>
+          <w:p>
+            <w:pPr>
+              <w:rPr>
+                <w:rFonts w:ascii="Segoe UI" w:hAnsi="Segoe UI" w:cs="Segoe UI"/>
+                <w:color w:val="000000" w:themeColor="text1"/>
+                <w:sz w:val="20"/>
+                <w:szCs w:val="20"/>
+              </w:rPr>
+            </w:pPr>
+            <w:r>
+              <w:rPr>
+                <w:rFonts w:ascii="Segoe UI" w:hAnsi="Segoe UI" w:cs="Segoe UI"/>
+                <w:color w:val="000000" w:themeColor="text1"/>
+                <w:sz w:val="20"/>
+                <w:szCs w:val="20"/>
+              </w:rPr>
+              <w:t>Working, with reason logged</w:t>
+            </w:r>
+          </w:p>
+        </w:tc>
+      </w:tr>
+      <w:tr>
+        <w:tc>
+          <w:tcPr>
+            <w:tcW w:w="0" w:type="auto"/>
+            <w:tcMar>
+              <w:top w:w="30" w:type="dxa"/>
+              <w:left w:w="30" w:type="dxa"/>
+              <w:bottom w:w="30" w:type="dxa"/>
+              <w:right w:w="30" w:type="dxa"/>
+            </w:tcMar>
+            <w:vAlign w:val="center"/>
+            <w:hideMark/>
+          </w:tcPr>
+          <w:p>
+            <w:pPr>
+              <w:rPr>
+                <w:rFonts w:ascii="Segoe UI" w:hAnsi="Segoe UI" w:cs="Segoe UI"/>
+                <w:color w:val="000000" w:themeColor="text1"/>
+                <w:sz w:val="20"/>
+                <w:szCs w:val="20"/>
+              </w:rPr>
+            </w:pPr>
+            <w:r>
+              <w:rPr>
+                <w:rStyle w:val="Strong"/>
+                <w:rFonts w:ascii="Segoe UI" w:hAnsi="Segoe UI" w:cs="Segoe UI"/>
+                <w:color w:val="000000" w:themeColor="text1"/>
+                <w:sz w:val="20"/>
+                <w:szCs w:val="20"/>
+              </w:rPr>
+              <w:t>Response time</w:t>
+            </w:r>
+          </w:p>
+        </w:tc>
+        <w:tc>
+          <w:tcPr>
+            <w:tcW w:w="0" w:type="auto"/>
+            <w:tcMar>
+              <w:top w:w="30" w:type="dxa"/>
+              <w:left w:w="30" w:type="dxa"/>
+              <w:bottom w:w="30" w:type="dxa"/>
+              <w:right w:w="30" w:type="dxa"/>
+            </w:tcMar>
+            <w:vAlign w:val="center"/>
+            <w:hideMark/>
+          </w:tcPr>
+          <w:p>
+            <w:pPr>
+              <w:rPr>
+                <w:rFonts w:ascii="Segoe UI" w:hAnsi="Segoe UI" w:cs="Segoe UI"/>
+                <w:color w:val="000000" w:themeColor="text1"/>
+                <w:sz w:val="20"/>
+                <w:szCs w:val="20"/>
+              </w:rPr>
+            </w:pPr>
+            <w:r>
+              <w:rPr>
+                <w:rFonts w:ascii="Segoe UI" w:hAnsi="Segoe UI" w:cs="Segoe UI"/>
+                <w:color w:val="000000" w:themeColor="text1"/>
+                <w:sz w:val="20"/>
+                <w:szCs w:val="20"/>
+              </w:rPr>
+              <w:t>Time from message to recommendation</w:t>
+            </w:r>
+          </w:p>
+        </w:tc>
+        <w:tc>
+          <w:tcPr>
+            <w:tcW w:w="0" w:type="auto"/>
+            <w:tcMar>
+              <w:top w:w="30" w:type="dxa"/>
+              <w:left w:w="30" w:type="dxa"/>
+              <w:bottom w:w="30" w:type="dxa"/>
+              <w:right w:w="30" w:type="dxa"/>
+            </w:tcMar>
+            <w:vAlign w:val="center"/>
+            <w:hideMark/>
+          </w:tcPr>
+          <w:p>
+            <w:pPr>
+              <w:rPr>
+                <w:rFonts w:ascii="Segoe UI" w:hAnsi="Segoe UI" w:cs="Segoe UI"/>
+                <w:color w:val="000000" w:themeColor="text1"/>
+                <w:sz w:val="20"/>
+                <w:szCs w:val="20"/>
+              </w:rPr>
+            </w:pPr>
+            <w:r>
+              <w:rPr>
+                <w:rFonts w:ascii="Segoe UI" w:hAnsi="Segoe UI" w:cs="Segoe UI"/>
+                <w:color w:val="000000" w:themeColor="text1"/>
+                <w:sz w:val="20"/>
+                <w:szCs w:val="20"/>
+              </w:rPr>
+              <w:t>Under 10 seconds</w:t>
             </w:r>
           </w:p>
         </w:tc>
@@ -2338,290 +4824,266 @@
     </w:tbl>
     <w:p>
       <w:pPr>
-        <w:pStyle w:val="NormalWeb"/>
-        <w:spacing w:before="24" w:beforeAutospacing="0" w:after="48" w:afterAutospacing="0"/>
+        <w:shd w:val="clear" w:color="auto" w:fill="FFFFFF" w:themeFill="background1"/>
+        <w:rPr>
+          <w:color w:val="000000" w:themeColor="text1"/>
+          <w:lang w:val="en-US"/>
+        </w:rPr>
+      </w:pPr>
+    </w:p>
+    <w:p>
+      <w:pPr>
+        <w:pStyle w:val="Heading3"/>
         <w:rPr>
           <w:rFonts w:ascii="Segoe UI" w:hAnsi="Segoe UI" w:cs="Segoe UI"/>
           <w:color w:val="000000" w:themeColor="text1"/>
-          <w:sz w:val="20"/>
-          <w:szCs w:val="20"/>
         </w:rPr>
       </w:pPr>
       <w:r>
         <w:rPr>
           <w:rFonts w:ascii="Segoe UI" w:hAnsi="Segoe UI" w:cs="Segoe UI"/>
           <w:color w:val="000000" w:themeColor="text1"/>
-          <w:sz w:val="20"/>
-          <w:szCs w:val="20"/>
-        </w:rPr>
-        <w:t xml:space="preserve">When one workshop suddenly closes for two weeks, our late rate only rises from </w:t>
-      </w:r>
-      <w:r>
-        <w:rPr>
-          <w:rStyle w:val="Strong"/>
-          <w:rFonts w:ascii="Segoe UI" w:hAnsi="Segoe UI" w:cs="Segoe UI"/>
-          <w:color w:val="000000" w:themeColor="text1"/>
-          <w:sz w:val="20"/>
-          <w:szCs w:val="20"/>
-        </w:rPr>
-        <w:t>1.7% to 1.9%</w:t>
-      </w:r>
-      <w:r>
-        <w:rPr>
-          <w:rFonts w:ascii="Segoe UI" w:hAnsi="Segoe UI" w:cs="Segoe UI"/>
-          <w:color w:val="000000" w:themeColor="text1"/>
-          <w:sz w:val="20"/>
-          <w:szCs w:val="20"/>
-        </w:rPr>
-        <w:t xml:space="preserve"> (random: 34% → 38%).</w:t>
+        </w:rPr>
+        <w:t xml:space="preserve">Simulator </w:t>
       </w:r>
     </w:p>
-    <w:p>
-      <w:pPr>
-        <w:pStyle w:val="NormalWeb"/>
-        <w:spacing w:before="24" w:beforeAutospacing="0" w:after="48" w:afterAutospacing="0"/>
-        <w:rPr>
-          <w:rFonts w:ascii="Segoe UI" w:hAnsi="Segoe UI" w:cs="Segoe UI"/>
-          <w:color w:val="000000" w:themeColor="text1"/>
-          <w:sz w:val="20"/>
-          <w:szCs w:val="20"/>
-        </w:rPr>
-      </w:pPr>
-      <w:r>
-        <w:rPr>
-          <w:rStyle w:val="Strong"/>
-          <w:rFonts w:ascii="Segoe UI" w:hAnsi="Segoe UI" w:cs="Segoe UI"/>
-          <w:color w:val="000000" w:themeColor="text1"/>
-          <w:sz w:val="20"/>
-          <w:szCs w:val="20"/>
-        </w:rPr>
-        <w:t>Key findings</w:t>
-      </w:r>
-    </w:p>
-    <w:p>
-      <w:pPr>
-        <w:numPr>
-          <w:ilvl w:val="0"/>
-          <w:numId w:val="9"/>
-        </w:numPr>
-        <w:spacing w:before="100" w:beforeAutospacing="1" w:after="100" w:afterAutospacing="1"/>
-        <w:rPr>
-          <w:rFonts w:ascii="Segoe UI" w:hAnsi="Segoe UI" w:cs="Segoe UI"/>
-          <w:color w:val="000000" w:themeColor="text1"/>
-          <w:sz w:val="20"/>
-          <w:szCs w:val="20"/>
-        </w:rPr>
-      </w:pPr>
-      <w:r>
-        <w:rPr>
-          <w:rStyle w:val="Strong"/>
-          <w:rFonts w:ascii="Segoe UI" w:hAnsi="Segoe UI" w:cs="Segoe UI"/>
-          <w:color w:val="000000" w:themeColor="text1"/>
-          <w:sz w:val="20"/>
-          <w:szCs w:val="20"/>
-        </w:rPr>
-        <w:t>For on-time delivery, our system makes the same choices as a simple "pick whichever finishes first" rule:</w:t>
-      </w:r>
-      <w:r>
-        <w:rPr>
-          <w:rFonts w:ascii="Segoe UI" w:hAnsi="Segoe UI" w:cs="Segoe UI"/>
-          <w:color w:val="000000" w:themeColor="text1"/>
-          <w:sz w:val="20"/>
-          <w:szCs w:val="20"/>
-        </w:rPr>
-        <w:t> both get 1.7% late. Our added value is everything around the choice: reading chat, asking when unclear, refusing unsuitable workshops, and keeping a record.</w:t>
-      </w:r>
-    </w:p>
-    <w:p>
-      <w:pPr>
-        <w:numPr>
-          <w:ilvl w:val="0"/>
-          <w:numId w:val="9"/>
-        </w:numPr>
-        <w:spacing w:before="100" w:beforeAutospacing="1" w:after="100" w:afterAutospacing="1"/>
-        <w:rPr>
-          <w:rFonts w:ascii="Segoe UI" w:hAnsi="Segoe UI" w:cs="Segoe UI"/>
-          <w:color w:val="000000" w:themeColor="text1"/>
-          <w:sz w:val="20"/>
-          <w:szCs w:val="20"/>
-        </w:rPr>
-      </w:pPr>
-      <w:r>
-        <w:rPr>
-          <w:rStyle w:val="Strong"/>
-          <w:rFonts w:ascii="Segoe UI" w:hAnsi="Segoe UI" w:cs="Segoe UI"/>
-          <w:color w:val="000000" w:themeColor="text1"/>
-          <w:sz w:val="20"/>
-          <w:szCs w:val="20"/>
-        </w:rPr>
-        <w:lastRenderedPageBreak/>
-        <w:t>Spreading work more evenly costs some on-time performance.</w:t>
-      </w:r>
-      <w:r>
-        <w:rPr>
-          <w:rFonts w:ascii="Segoe UI" w:hAnsi="Segoe UI" w:cs="Segoe UI"/>
-          <w:color w:val="000000" w:themeColor="text1"/>
-          <w:sz w:val="20"/>
-          <w:szCs w:val="20"/>
-        </w:rPr>
-        <w:t> The hybrid gives a fairer split than random while keeping late orders to 7%.</w:t>
-      </w:r>
-    </w:p>
-    <w:p>
-      <w:pPr>
-        <w:shd w:val="clear" w:color="auto" w:fill="FFFFFF" w:themeFill="background1"/>
-        <w:ind w:left="360"/>
-        <w:rPr>
-          <w:rFonts w:ascii="Segoe UI" w:hAnsi="Segoe UI" w:cs="Segoe UI"/>
-          <w:b/>
-          <w:bCs/>
-          <w:color w:val="000000" w:themeColor="text1"/>
-          <w:sz w:val="20"/>
-          <w:szCs w:val="20"/>
-        </w:rPr>
-      </w:pPr>
-      <w:r>
-        <w:rPr>
-          <w:b/>
-          <w:bCs/>
-          <w:color w:val="000000" w:themeColor="text1"/>
-          <w:lang w:val="en-US"/>
-        </w:rPr>
-        <w:t>Assumptions:</w:t>
-      </w:r>
-    </w:p>
-    <w:p>
-      <w:pPr>
-        <w:pStyle w:val="ListParagraph"/>
-        <w:numPr>
-          <w:ilvl w:val="0"/>
-          <w:numId w:val="10"/>
-        </w:numPr>
-        <w:shd w:val="clear" w:color="auto" w:fill="FFFFFF" w:themeFill="background1"/>
-        <w:rPr>
-          <w:rFonts w:ascii="Segoe UI" w:hAnsi="Segoe UI" w:cs="Segoe UI"/>
-          <w:color w:val="000000" w:themeColor="text1"/>
-          <w:sz w:val="20"/>
-          <w:szCs w:val="20"/>
-        </w:rPr>
-      </w:pPr>
-      <w:r>
-        <w:rPr>
-          <w:rFonts w:ascii="Segoe UI" w:hAnsi="Segoe UI" w:cs="Segoe UI"/>
-          <w:color w:val="000000" w:themeColor="text1"/>
-          <w:sz w:val="20"/>
-          <w:szCs w:val="20"/>
-        </w:rPr>
-        <w:t>Workshop profile cards (capacity, queue, status, defect rate) are accurate on the day of the decision</w:t>
-      </w:r>
-    </w:p>
-    <w:p>
-      <w:pPr>
-        <w:pStyle w:val="ListParagraph"/>
-        <w:numPr>
-          <w:ilvl w:val="0"/>
-          <w:numId w:val="10"/>
-        </w:numPr>
-        <w:shd w:val="clear" w:color="auto" w:fill="FFFFFF" w:themeFill="background1"/>
-        <w:rPr>
-          <w:rFonts w:ascii="Segoe UI" w:hAnsi="Segoe UI" w:cs="Segoe UI"/>
-          <w:color w:val="000000" w:themeColor="text1"/>
-          <w:sz w:val="20"/>
-          <w:szCs w:val="20"/>
-        </w:rPr>
-      </w:pPr>
-      <w:r>
-        <w:rPr>
-          <w:rFonts w:ascii="Segoe UI" w:hAnsi="Segoe UI" w:cs="Segoe UI"/>
-          <w:color w:val="000000" w:themeColor="text1"/>
-          <w:sz w:val="20"/>
-          <w:szCs w:val="20"/>
-        </w:rPr>
-        <w:t>Delivery time = queue + making time + transport</w:t>
-      </w:r>
-    </w:p>
-    <w:p>
-      <w:pPr>
-        <w:pStyle w:val="ListParagraph"/>
-        <w:numPr>
-          <w:ilvl w:val="0"/>
-          <w:numId w:val="9"/>
-        </w:numPr>
-        <w:rPr>
-          <w:rFonts w:ascii="Segoe UI" w:hAnsi="Segoe UI" w:cs="Segoe UI"/>
-          <w:color w:val="000000" w:themeColor="text1"/>
-          <w:sz w:val="20"/>
-          <w:szCs w:val="20"/>
-        </w:rPr>
-      </w:pPr>
-      <w:r>
-        <w:rPr>
-          <w:rFonts w:ascii="Segoe UI" w:hAnsi="Segoe UI" w:cs="Segoe UI"/>
-          <w:color w:val="000000" w:themeColor="text1"/>
-          <w:sz w:val="20"/>
-          <w:szCs w:val="20"/>
-        </w:rPr>
-        <w:t>The AI can reliably pull the right details out of short, informal chat messages</w:t>
-      </w:r>
-    </w:p>
-    <w:p>
-      <w:pPr>
-        <w:pStyle w:val="ListParagraph"/>
-        <w:numPr>
-          <w:ilvl w:val="0"/>
-          <w:numId w:val="9"/>
-        </w:numPr>
-        <w:rPr>
-          <w:rFonts w:ascii="Segoe UI" w:hAnsi="Segoe UI" w:cs="Segoe UI"/>
-          <w:color w:val="000000" w:themeColor="text1"/>
-          <w:sz w:val="20"/>
-          <w:szCs w:val="20"/>
-        </w:rPr>
-      </w:pPr>
-      <w:r>
-        <w:rPr>
-          <w:rFonts w:ascii="Segoe UI" w:hAnsi="Segoe UI" w:cs="Segoe UI"/>
-          <w:color w:val="000000" w:themeColor="text1"/>
-          <w:sz w:val="20"/>
-          <w:szCs w:val="20"/>
-        </w:rPr>
-        <w:t>A dispatcher will review and confirm each recommendation rather than auto-send it</w:t>
-      </w:r>
-    </w:p>
-    <w:p>
-      <w:pPr>
-        <w:pStyle w:val="ListParagraph"/>
-        <w:numPr>
-          <w:ilvl w:val="0"/>
-          <w:numId w:val="9"/>
-        </w:numPr>
-        <w:rPr>
-          <w:rFonts w:ascii="Segoe UI" w:hAnsi="Segoe UI" w:cs="Segoe UI"/>
-          <w:color w:val="000000" w:themeColor="text1"/>
-          <w:sz w:val="20"/>
-          <w:szCs w:val="20"/>
-        </w:rPr>
-      </w:pPr>
-      <w:r>
-        <w:rPr>
-          <w:rFonts w:ascii="Segoe UI" w:hAnsi="Segoe UI" w:cs="Segoe UI"/>
-          <w:color w:val="000000" w:themeColor="text1"/>
-          <w:sz w:val="20"/>
-          <w:szCs w:val="20"/>
-        </w:rPr>
-        <w:t>Cost = pieces × per-piece rate (no transport or rework fees)</w:t>
-      </w:r>
-    </w:p>
-    <w:p>
-      <w:pPr>
-        <w:rPr>
-          <w:rFonts w:ascii="Segoe UI" w:hAnsi="Segoe UI" w:cs="Segoe UI"/>
-          <w:color w:val="CCCCCC"/>
-          <w:sz w:val="20"/>
-          <w:szCs w:val="20"/>
-        </w:rPr>
-      </w:pPr>
-    </w:p>
+    <w:tbl>
+      <w:tblPr>
+        <w:tblW w:w="0" w:type="auto"/>
+        <w:shd w:val="clear" w:color="auto" w:fill="181818"/>
+        <w:tblCellMar>
+          <w:top w:w="15" w:type="dxa"/>
+          <w:left w:w="15" w:type="dxa"/>
+          <w:bottom w:w="15" w:type="dxa"/>
+          <w:right w:w="15" w:type="dxa"/>
+        </w:tblCellMar>
+        <w:tblLook w:val="04A0" w:firstRow="1" w:lastRow="0" w:firstColumn="1" w:lastColumn="0" w:noHBand="0" w:noVBand="1"/>
+      </w:tblPr>
+      <w:tblGrid>
+        <w:gridCol w:w="3307"/>
+        <w:gridCol w:w="4369"/>
+      </w:tblGrid>
+      <w:tr>
+        <w:trPr>
+          <w:tblHeader/>
+        </w:trPr>
+        <w:tc>
+          <w:tcPr>
+            <w:tcW w:w="0" w:type="auto"/>
+            <w:tcMar>
+              <w:top w:w="30" w:type="dxa"/>
+              <w:left w:w="30" w:type="dxa"/>
+              <w:bottom w:w="30" w:type="dxa"/>
+              <w:right w:w="30" w:type="dxa"/>
+            </w:tcMar>
+            <w:vAlign w:val="center"/>
+            <w:hideMark/>
+          </w:tcPr>
+          <w:p>
+            <w:pPr>
+              <w:jc w:val="center"/>
+              <w:rPr>
+                <w:rFonts w:ascii="Segoe UI" w:hAnsi="Segoe UI" w:cs="Segoe UI"/>
+                <w:b/>
+                <w:bCs/>
+                <w:color w:val="000000" w:themeColor="text1"/>
+                <w:sz w:val="20"/>
+                <w:szCs w:val="20"/>
+              </w:rPr>
+            </w:pPr>
+            <w:r>
+              <w:rPr>
+                <w:rFonts w:ascii="Segoe UI" w:hAnsi="Segoe UI" w:cs="Segoe UI"/>
+                <w:b/>
+                <w:bCs/>
+                <w:color w:val="000000" w:themeColor="text1"/>
+                <w:sz w:val="20"/>
+                <w:szCs w:val="20"/>
+              </w:rPr>
+              <w:t>Criterion</w:t>
+            </w:r>
+          </w:p>
+        </w:tc>
+        <w:tc>
+          <w:tcPr>
+            <w:tcW w:w="0" w:type="auto"/>
+            <w:tcMar>
+              <w:top w:w="30" w:type="dxa"/>
+              <w:left w:w="30" w:type="dxa"/>
+              <w:bottom w:w="30" w:type="dxa"/>
+              <w:right w:w="30" w:type="dxa"/>
+            </w:tcMar>
+            <w:vAlign w:val="center"/>
+            <w:hideMark/>
+          </w:tcPr>
+          <w:p>
+            <w:pPr>
+              <w:jc w:val="center"/>
+              <w:rPr>
+                <w:rFonts w:ascii="Segoe UI" w:hAnsi="Segoe UI" w:cs="Segoe UI"/>
+                <w:b/>
+                <w:bCs/>
+                <w:color w:val="000000" w:themeColor="text1"/>
+                <w:sz w:val="20"/>
+                <w:szCs w:val="20"/>
+              </w:rPr>
+            </w:pPr>
+            <w:r>
+              <w:rPr>
+                <w:rFonts w:ascii="Segoe UI" w:hAnsi="Segoe UI" w:cs="Segoe UI"/>
+                <w:b/>
+                <w:bCs/>
+                <w:color w:val="000000" w:themeColor="text1"/>
+                <w:sz w:val="20"/>
+                <w:szCs w:val="20"/>
+              </w:rPr>
+              <w:t>Target</w:t>
+            </w:r>
+          </w:p>
+        </w:tc>
+      </w:tr>
+      <w:tr>
+        <w:tc>
+          <w:tcPr>
+            <w:tcW w:w="0" w:type="auto"/>
+            <w:tcMar>
+              <w:top w:w="30" w:type="dxa"/>
+              <w:left w:w="30" w:type="dxa"/>
+              <w:bottom w:w="30" w:type="dxa"/>
+              <w:right w:w="30" w:type="dxa"/>
+            </w:tcMar>
+            <w:vAlign w:val="center"/>
+            <w:hideMark/>
+          </w:tcPr>
+          <w:p>
+            <w:pPr>
+              <w:rPr>
+                <w:rFonts w:ascii="Segoe UI" w:hAnsi="Segoe UI" w:cs="Segoe UI"/>
+                <w:color w:val="000000" w:themeColor="text1"/>
+                <w:sz w:val="20"/>
+                <w:szCs w:val="20"/>
+              </w:rPr>
+            </w:pPr>
+            <w:r>
+              <w:rPr>
+                <w:rFonts w:ascii="Segoe UI" w:hAnsi="Segoe UI" w:cs="Segoe UI"/>
+                <w:color w:val="000000" w:themeColor="text1"/>
+                <w:sz w:val="20"/>
+                <w:szCs w:val="20"/>
+              </w:rPr>
+              <w:t>Fewer late orders than all 3 baselines</w:t>
+            </w:r>
+          </w:p>
+        </w:tc>
+        <w:tc>
+          <w:tcPr>
+            <w:tcW w:w="0" w:type="auto"/>
+            <w:tcMar>
+              <w:top w:w="30" w:type="dxa"/>
+              <w:left w:w="30" w:type="dxa"/>
+              <w:bottom w:w="30" w:type="dxa"/>
+              <w:right w:w="30" w:type="dxa"/>
+            </w:tcMar>
+            <w:vAlign w:val="center"/>
+            <w:hideMark/>
+          </w:tcPr>
+          <w:p>
+            <w:pPr>
+              <w:rPr>
+                <w:rFonts w:ascii="Segoe UI" w:hAnsi="Segoe UI" w:cs="Segoe UI"/>
+                <w:color w:val="000000" w:themeColor="text1"/>
+                <w:sz w:val="20"/>
+                <w:szCs w:val="20"/>
+              </w:rPr>
+            </w:pPr>
+            <w:r>
+              <w:rPr>
+                <w:rFonts w:ascii="Segoe UI" w:hAnsi="Segoe UI" w:cs="Segoe UI"/>
+                <w:color w:val="000000" w:themeColor="text1"/>
+                <w:sz w:val="20"/>
+                <w:szCs w:val="20"/>
+              </w:rPr>
+              <w:t>Lower % late than random, biggest and cheapest</w:t>
+            </w:r>
+          </w:p>
+        </w:tc>
+      </w:tr>
+      <w:tr>
+        <w:tc>
+          <w:tcPr>
+            <w:tcW w:w="0" w:type="auto"/>
+            <w:tcMar>
+              <w:top w:w="30" w:type="dxa"/>
+              <w:left w:w="30" w:type="dxa"/>
+              <w:bottom w:w="30" w:type="dxa"/>
+              <w:right w:w="30" w:type="dxa"/>
+            </w:tcMar>
+            <w:vAlign w:val="center"/>
+            <w:hideMark/>
+          </w:tcPr>
+          <w:p>
+            <w:pPr>
+              <w:rPr>
+                <w:rFonts w:ascii="Segoe UI" w:hAnsi="Segoe UI" w:cs="Segoe UI"/>
+                <w:color w:val="000000" w:themeColor="text1"/>
+                <w:sz w:val="20"/>
+                <w:szCs w:val="20"/>
+              </w:rPr>
+            </w:pPr>
+            <w:r>
+              <w:rPr>
+                <w:rFonts w:ascii="Segoe UI" w:hAnsi="Segoe UI" w:cs="Segoe UI"/>
+                <w:color w:val="000000" w:themeColor="text1"/>
+                <w:sz w:val="20"/>
+                <w:szCs w:val="20"/>
+              </w:rPr>
+              <w:t xml:space="preserve">Robustness &amp; </w:t>
+            </w:r>
+            <w:r>
+              <w:rPr>
+                <w:rFonts w:ascii="Segoe UI" w:hAnsi="Segoe UI" w:cs="Segoe UI"/>
+                <w:color w:val="000000" w:themeColor="text1"/>
+                <w:sz w:val="20"/>
+                <w:szCs w:val="20"/>
+              </w:rPr>
+              <w:t xml:space="preserve"> and hybrid reported</w:t>
+            </w:r>
+          </w:p>
+        </w:tc>
+        <w:tc>
+          <w:tcPr>
+            <w:tcW w:w="0" w:type="auto"/>
+            <w:tcMar>
+              <w:top w:w="30" w:type="dxa"/>
+              <w:left w:w="30" w:type="dxa"/>
+              <w:bottom w:w="30" w:type="dxa"/>
+              <w:right w:w="30" w:type="dxa"/>
+            </w:tcMar>
+            <w:vAlign w:val="center"/>
+            <w:hideMark/>
+          </w:tcPr>
+          <w:p>
+            <w:pPr>
+              <w:rPr>
+                <w:rFonts w:ascii="Segoe UI" w:hAnsi="Segoe UI" w:cs="Segoe UI"/>
+                <w:color w:val="000000" w:themeColor="text1"/>
+                <w:sz w:val="20"/>
+                <w:szCs w:val="20"/>
+              </w:rPr>
+            </w:pPr>
+            <w:r>
+              <w:rPr>
+                <w:rFonts w:ascii="Segoe UI" w:hAnsi="Segoe UI" w:cs="Segoe UI"/>
+                <w:color w:val="000000" w:themeColor="text1"/>
+                <w:sz w:val="20"/>
+                <w:szCs w:val="20"/>
+              </w:rPr>
+              <w:t>Report against baseline</w:t>
+            </w:r>
+          </w:p>
+        </w:tc>
+      </w:tr>
+    </w:tbl>
     <w:p>
       <w:pPr>
         <w:shd w:val="clear" w:color="auto" w:fill="FFFFFF" w:themeFill="background1"/>
@@ -4494,7 +6956,7 @@
   <w:style w:type="paragraph" w:default="1" w:styleId="Normal">
     <w:name w:val="Normal"/>
     <w:qFormat/>
-    <w:rsid w:val="00DF397E"/>
+    <w:rsid w:val="00C62ADE"/>
     <w:pPr>
       <w:spacing w:after="0" w:line="240" w:lineRule="auto"/>
     </w:pPr>
@@ -4555,7 +7017,6 @@
     <w:next w:val="Normal"/>
     <w:link w:val="Heading3Char"/>
     <w:uiPriority w:val="9"/>
-    <w:semiHidden/>
     <w:unhideWhenUsed/>
     <w:qFormat/>
     <w:rsid w:val="003239F3"/>
@@ -4761,7 +7222,6 @@
     <w:basedOn w:val="DefaultParagraphFont"/>
     <w:link w:val="Heading3"/>
     <w:uiPriority w:val="9"/>
-    <w:semiHidden/>
     <w:rsid w:val="003239F3"/>
     <w:rPr>
       <w:rFonts w:eastAsiaTheme="majorEastAsia" w:cstheme="majorBidi"/>

</xml_diff>